<commit_message>
updated the paper with less plagiarism and AI
</commit_message>
<xml_diff>
--- a/Documentation/Main Paper/Research.docx
+++ b/Documentation/Main Paper/Research.docx
@@ -88,7 +88,25 @@
           <w:szCs w:val="40"/>
           <w:lang w:val="en-GB"/>
         </w:rPr>
-        <w:t xml:space="preserve">Building Security Into Every Stage of the CI/CD Using </w:t>
+        <w:t xml:space="preserve">Building Security </w:t>
+      </w:r>
+      <w:proofErr w:type="gramStart"/>
+      <w:r>
+        <w:rPr>
+          <w:sz w:val="40"/>
+          <w:szCs w:val="40"/>
+          <w:lang w:val="en-GB"/>
+        </w:rPr>
+        <w:t>Into</w:t>
+      </w:r>
+      <w:proofErr w:type="gramEnd"/>
+      <w:r>
+        <w:rPr>
+          <w:sz w:val="40"/>
+          <w:szCs w:val="40"/>
+          <w:lang w:val="en-GB"/>
+        </w:rPr>
+        <w:t xml:space="preserve"> Every Stage of the CI/CD Using </w:t>
       </w:r>
       <w:proofErr w:type="spellStart"/>
       <w:r>
@@ -271,6 +289,7 @@
         </w:rPr>
         <w:t xml:space="preserve">Email: </w:t>
       </w:r>
+      <w:proofErr w:type="gramStart"/>
       <w:r>
         <w:rPr>
           <w:rFonts w:eastAsia="MS Mincho"/>
@@ -291,7 +310,15 @@
           <w:iCs/>
           <w:lang w:val="en-IN"/>
         </w:rPr>
-        <w:t>revanthkumarts123</w:t>
+        <w:t>revanthkumarts</w:t>
+      </w:r>
+      <w:proofErr w:type="gramEnd"/>
+      <w:r>
+        <w:rPr>
+          <w:iCs/>
+          <w:lang w:val="en-IN"/>
+        </w:rPr>
+        <w:t>123</w:t>
       </w:r>
       <w:r>
         <w:rPr>
@@ -441,6 +468,7 @@
         <w:t>Email: {</w:t>
       </w:r>
       <w:proofErr w:type="spellStart"/>
+      <w:proofErr w:type="gramStart"/>
       <w:r>
         <w:rPr>
           <w:iCs/>
@@ -448,6 +476,7 @@
         <w:t>sameena.hs</w:t>
       </w:r>
       <w:proofErr w:type="spellEnd"/>
+      <w:proofErr w:type="gramEnd"/>
       <w:r>
         <w:rPr>
           <w:rFonts w:eastAsia="MS Mincho"/>
@@ -790,7 +819,7 @@
       </w:r>
       <w:r>
         <w:lastRenderedPageBreak/>
-        <w:t xml:space="preserve">development just before it was being released. This was a bad way of working; however it was acceptable at the time because there were only a handful of new releases a couple of times per month. However, as the rate of releases into production was being pushed to one or several times per day, or per hour, it was no longer acceptable to be performed tests between the new releases and the new release. This generated serious problems; if a bug is discovered weeks after the development has been undertaken then it can be very complex to find a suitable fix, and also the fix could also have consequences to both business and technical decisions that would have been made at the beginning of the development. </w:t>
+        <w:t xml:space="preserve">development just before it was being released. This was a bad way of working however it was acceptable at the time because there were only a handful of new releases a couple of times per month. However, as the rate of releases into production was being pushed to one or several times per day, or per hour, it was no longer acceptable to be performed tests between the new releases and the new release. This generated serious problems if a bug is discovered weeks after the development has been undertaken then it can be very complex to find a suitable fix, and also the fix could also have consequences to both business and technical decisions that would have been made at the beginning of the development. </w:t>
       </w:r>
       <w:proofErr w:type="spellStart"/>
       <w:r>
@@ -798,7 +827,15 @@
       </w:r>
       <w:proofErr w:type="spellEnd"/>
       <w:r>
-        <w:t xml:space="preserve"> was born because software developers and IT professional were facing many of these problems; its basic underlying rule is that there cannot be security added to something that did not had it from the very first day</w:t>
+        <w:t xml:space="preserve"> was born because software developers and IT professional were facing many of these problems its basic underlying rule is that there cannot be security added to something that did not </w:t>
+      </w:r>
+      <w:proofErr w:type="gramStart"/>
+      <w:r>
+        <w:t>had</w:t>
+      </w:r>
+      <w:proofErr w:type="gramEnd"/>
+      <w:r>
+        <w:t xml:space="preserve"> it from the very first day</w:t>
       </w:r>
       <w:r>
         <w:t>.</w:t>
@@ -809,7 +846,7 @@
         <w:pStyle w:val="BodyText"/>
       </w:pPr>
       <w:r>
-        <w:t>For many companies, the challenge was not about convincing them to use a security solution, but to integrate a security solution into their already live production systems. Implementing a change to a live production system will always be risky and most engineering teams were already over-burdened and couldn't justify spending extra time finding a security solution. It was a problem with tooling as well; the point of a scanner is to provide a list of vulnerabilities, but a scanner can easily be misunderstood, or simply overlooked if the person viewing it doesn't truly understand what the results mean</w:t>
+        <w:t>For many companies, the challenge was not about convincing them to use a security solution, but to integrate a security solution into their already live production systems. Implementing a change to a live production system will always be risky and most engineering teams were already over-burdened and couldn't justify spending extra time finding a security solution. It was a problem with tooling as well the point of a scanner is to provide a list of vulnerabilities, but a scanner can easily be misunderstood, or simply overlooked if the person viewing it doesn't truly understand what the results mean</w:t>
       </w:r>
       <w:r>
         <w:t>.</w:t>
@@ -834,7 +871,7 @@
           <w:noProof/>
         </w:rPr>
         <w:drawing>
-          <wp:inline distT="0" distB="0" distL="0" distR="0" wp14:anchorId="0073B82B" wp14:editId="5889815D">
+          <wp:inline distT="0" distB="0" distL="0" distR="0" wp14:anchorId="0073B82B" wp14:editId="4E6AE8BF">
             <wp:extent cx="1665983" cy="1530930"/>
             <wp:effectExtent l="19050" t="19050" r="0" b="0"/>
             <wp:docPr id="1247418512" name="Picture 5"/>
@@ -996,33 +1033,75 @@
         <w:rPr>
           <w:lang w:val="en-IN"/>
         </w:rPr>
-        <w:t xml:space="preserve">. The development component entails code creation, system integration, and release management. On the other hand, operations involve the technical component of the system and ensure its availability, reliability, and scalability. Lastly, security encompasses scanning, identification, and controls. As illustrated by the figure </w:t>
-      </w:r>
-      <w:r>
-        <w:rPr>
-          <w:lang w:val="en-IN"/>
-        </w:rPr>
-        <w:t>below</w:t>
-      </w:r>
-      <w:r>
-        <w:rPr>
-          <w:lang w:val="en-IN"/>
-        </w:rPr>
-        <w:t xml:space="preserve">, these three components are not sequential; rather, they are concurrent. Each component influences the other two. The concept here is that if one of these three components were separated from the rest, the whole concept of </w:t>
+        <w:t xml:space="preserve">. </w:t>
+      </w:r>
+      <w:r>
+        <w:rPr>
+          <w:lang w:val="en-GB"/>
+        </w:rPr>
+        <w:t>Development part which is creating code, integration of system and releases</w:t>
+      </w:r>
+      <w:r>
+        <w:rPr>
+          <w:lang w:val="en-GB"/>
+        </w:rPr>
+        <w:t>.</w:t>
+      </w:r>
+      <w:r>
+        <w:rPr>
+          <w:lang w:val="en-GB"/>
+        </w:rPr>
+        <w:t xml:space="preserve"> Whereas Operations part which is basically the technical piece and making system available and reliable and scalable etc. Security part is scanning, identifying the threat and also placing controls to minimize them</w:t>
+      </w:r>
+      <w:r>
+        <w:rPr>
+          <w:lang w:val="en-GB"/>
+        </w:rPr>
+        <w:t>.</w:t>
+      </w:r>
+      <w:r>
+        <w:rPr>
+          <w:lang w:val="en-GB"/>
+        </w:rPr>
+        <w:t xml:space="preserve"> As the above fig </w:t>
+      </w:r>
+      <w:r>
+        <w:rPr>
+          <w:lang w:val="en-GB"/>
+        </w:rPr>
+        <w:t>above</w:t>
+      </w:r>
+      <w:r>
+        <w:rPr>
+          <w:lang w:val="en-GB"/>
+        </w:rPr>
+        <w:t xml:space="preserve"> shows, there is no sequence all three are happening at the same time and influencing each other. The whole idea is that if you take out any of these three areas from each other</w:t>
+      </w:r>
+      <w:r>
+        <w:rPr>
+          <w:lang w:val="en-GB"/>
+        </w:rPr>
+        <w:t>.</w:t>
+      </w:r>
+      <w:r>
+        <w:rPr>
+          <w:lang w:val="en-GB"/>
+        </w:rPr>
+        <w:t xml:space="preserve"> </w:t>
       </w:r>
       <w:proofErr w:type="spellStart"/>
       <w:r>
         <w:rPr>
-          <w:lang w:val="en-IN"/>
+          <w:lang w:val="en-GB"/>
         </w:rPr>
         <w:t>DevSecOps</w:t>
       </w:r>
       <w:proofErr w:type="spellEnd"/>
       <w:r>
         <w:rPr>
-          <w:lang w:val="en-IN"/>
-        </w:rPr>
-        <w:t xml:space="preserve"> will crumble</w:t>
+          <w:lang w:val="en-GB"/>
+        </w:rPr>
+        <w:t xml:space="preserve"> concept won’t stand anywhere</w:t>
       </w:r>
       <w:r>
         <w:rPr>
@@ -1080,10 +1159,18 @@
       </w:r>
       <w:proofErr w:type="spellEnd"/>
       <w:r>
-        <w:t xml:space="preserve"> and OWASP ZAP into the pipeline at various points. The idea was to check which stages were actually picking up security issues and which ones were missing them. Finding vulnerabilities before deployment was shown to be possible, which was a useful outcome. That said, container security was not part of what they looked at, and nothing was set up to monitor the system after it went live</w:t>
-      </w:r>
-      <w:r>
-        <w:t>[1]</w:t>
+        <w:t xml:space="preserve"> and OWASP ZAP into the pipeline at various points. The idea was to check which stages were actually picking up security issues and which ones were missing them. Finding vulnerabilities before deployment was shown to be possible, which was a useful outcome. That said, container security was not part of what they looked at, and nothing was set up to monitor the system after it went </w:t>
+      </w:r>
+      <w:proofErr w:type="gramStart"/>
+      <w:r>
+        <w:t>live</w:t>
+      </w:r>
+      <w:r>
+        <w:t>[</w:t>
+      </w:r>
+      <w:proofErr w:type="gramEnd"/>
+      <w:r>
+        <w:t>1]</w:t>
       </w:r>
       <w:r>
         <w:t>.</w:t>
@@ -1117,10 +1204,18 @@
       </w:r>
       <w:proofErr w:type="spellEnd"/>
       <w:r>
-        <w:t xml:space="preserve"> were the tools they worked with, and Docker was running alongside everything. They did not stop at just scanning either — dashboards were added and parts of the remediation process were automated, so when issues came up the team had less manual work to get through. Even with those additions though, scanning container images and watching the runtime environment were still not covered</w:t>
-      </w:r>
-      <w:r>
-        <w:t>[4]</w:t>
+        <w:t xml:space="preserve"> were the tools they worked with, and Docker was running alongside everything. They did not stop at just scanning either — dashboards were added and parts of the remediation process were automated, so when issues came up the team had less manual work to get through. Even with those additions though, scanning container images and watching the runtime environment were still not </w:t>
+      </w:r>
+      <w:proofErr w:type="gramStart"/>
+      <w:r>
+        <w:t>covered</w:t>
+      </w:r>
+      <w:r>
+        <w:t>[</w:t>
+      </w:r>
+      <w:proofErr w:type="gramEnd"/>
+      <w:r>
+        <w:t>4]</w:t>
       </w:r>
       <w:r>
         <w:t>.</w:t>
@@ -1166,10 +1261,18 @@
         <w:t>approaches that had gone unchanged for a long time</w:t>
       </w:r>
       <w:r>
-        <w:t>. On top of that, different groups within the same organisation were often not communicating well with each other. Fixing the technical setup was the easier part of the problem — shifting how people actually worked and collaborated on a daily basis was where things got genuinely difficult</w:t>
-      </w:r>
-      <w:r>
-        <w:t>[7]</w:t>
+        <w:t xml:space="preserve">. On top of that, different groups within the same organisation were often not communicating well with each other. Fixing the technical setup was the easier part of the problem — shifting how people actually worked and collaborated on a daily basis was where things got genuinely </w:t>
+      </w:r>
+      <w:proofErr w:type="gramStart"/>
+      <w:r>
+        <w:t>difficult</w:t>
+      </w:r>
+      <w:r>
+        <w:t>[</w:t>
+      </w:r>
+      <w:proofErr w:type="gramEnd"/>
+      <w:r>
+        <w:t>7]</w:t>
       </w:r>
       <w:r>
         <w:t>.</w:t>
@@ -1214,11 +1317,16 @@
         <w:t xml:space="preserve"> </w:t>
       </w:r>
       <w:r>
-        <w:t>outside of controlled settings. That is a real limitation because it leaves open the question of how any of it would hold up in a live environment where conditions are messier and less predictable</w:t>
+        <w:t xml:space="preserve">outside of controlled settings. That is a real limitation because it leaves open the question of how any of it would hold up in a live environment where conditions are messier and less </w:t>
+      </w:r>
+      <w:proofErr w:type="gramStart"/>
+      <w:r>
+        <w:t>predictable</w:t>
       </w:r>
       <w:r>
         <w:t>[</w:t>
       </w:r>
+      <w:proofErr w:type="gramEnd"/>
       <w:r>
         <w:t>11</w:t>
       </w:r>
@@ -1293,11 +1401,16 @@
         <w:t>helps to check</w:t>
       </w:r>
       <w:r>
-        <w:t xml:space="preserve"> container-related issues</w:t>
+        <w:t xml:space="preserve"> container-related </w:t>
+      </w:r>
+      <w:proofErr w:type="gramStart"/>
+      <w:r>
+        <w:t>issues</w:t>
       </w:r>
       <w:r>
         <w:t>[</w:t>
       </w:r>
+      <w:proofErr w:type="gramEnd"/>
       <w:r>
         <w:t>2</w:t>
       </w:r>
@@ -1340,11 +1453,16 @@
         <w:t xml:space="preserve">, some studies follow the CAMS model. </w:t>
       </w:r>
       <w:r>
-        <w:t>This mainly includes culture, automation, measurement and sharing.</w:t>
+        <w:t xml:space="preserve">This mainly includes culture, automation, measurement and </w:t>
+      </w:r>
+      <w:proofErr w:type="gramStart"/>
+      <w:r>
+        <w:t>sharing.</w:t>
       </w:r>
       <w:r>
         <w:t>.</w:t>
       </w:r>
+      <w:proofErr w:type="gramEnd"/>
       <w:r>
         <w:t xml:space="preserve"> </w:t>
       </w:r>
@@ -1403,13 +1521,21 @@
         <w:t xml:space="preserve">demonstrated a measurable effect on </w:t>
       </w:r>
       <w:r>
-        <w:t>an effect on</w:t>
+        <w:t xml:space="preserve">an effect </w:t>
+      </w:r>
+      <w:proofErr w:type="gramStart"/>
+      <w:r>
+        <w:t>on</w:t>
       </w:r>
       <w:r>
         <w:t xml:space="preserve"> </w:t>
       </w:r>
       <w:r>
-        <w:t xml:space="preserve"> a strong effect on</w:t>
+        <w:t xml:space="preserve"> a</w:t>
+      </w:r>
+      <w:proofErr w:type="gramEnd"/>
+      <w:r>
+        <w:t xml:space="preserve"> strong effect on</w:t>
       </w:r>
       <w:r>
         <w:t xml:space="preserve"> successfully applying </w:t>
@@ -1420,11 +1546,16 @@
       </w:r>
       <w:proofErr w:type="spellEnd"/>
       <w:r>
-        <w:t xml:space="preserve"> in real environments</w:t>
+        <w:t xml:space="preserve"> in real </w:t>
+      </w:r>
+      <w:proofErr w:type="gramStart"/>
+      <w:r>
+        <w:t>environments</w:t>
       </w:r>
       <w:r>
         <w:t>[</w:t>
       </w:r>
+      <w:proofErr w:type="gramEnd"/>
       <w:r>
         <w:t>8</w:t>
       </w:r>
@@ -1538,7 +1669,14 @@
         <w:rPr>
           <w:lang w:val="en-IN"/>
         </w:rPr>
-        <w:t>This leads to the necessity of merging multiple stages of the pipeline into one system</w:t>
+        <w:t xml:space="preserve">This leads to the necessity of merging multiple stages of the pipeline into one </w:t>
+      </w:r>
+      <w:proofErr w:type="gramStart"/>
+      <w:r>
+        <w:rPr>
+          <w:lang w:val="en-IN"/>
+        </w:rPr>
+        <w:t>system</w:t>
       </w:r>
       <w:r>
         <w:t>.</w:t>
@@ -1547,7 +1685,14 @@
         <w:rPr>
           <w:lang w:val="en-IN"/>
         </w:rPr>
-        <w:t>This work tries to piece these things together in a way that security can be checked at every step along the way</w:t>
+        <w:t>This</w:t>
+      </w:r>
+      <w:proofErr w:type="gramEnd"/>
+      <w:r>
+        <w:rPr>
+          <w:lang w:val="en-IN"/>
+        </w:rPr>
+        <w:t xml:space="preserve"> work tries to piece these things together in a way that security can be checked at every step along the way</w:t>
       </w:r>
       <w:r>
         <w:t>.</w:t>
@@ -1590,56 +1735,84 @@
         <w:rPr>
           <w:lang w:val="en-IN"/>
         </w:rPr>
-        <w:t>DevSecOpspipelinefor</w:t>
+        <w:t>DevSecOps</w:t>
       </w:r>
       <w:proofErr w:type="spellEnd"/>
       <w:r>
         <w:rPr>
           <w:lang w:val="en-IN"/>
         </w:rPr>
-        <w:t xml:space="preserve"> CI/CD The idea of implementing a secure </w:t>
+        <w:t xml:space="preserve"> </w:t>
+      </w:r>
+      <w:r>
+        <w:rPr>
+          <w:lang w:val="en-IN"/>
+        </w:rPr>
+        <w:t>pipeline</w:t>
+      </w:r>
+      <w:r>
+        <w:rPr>
+          <w:lang w:val="en-IN"/>
+        </w:rPr>
+        <w:t xml:space="preserve"> </w:t>
+      </w:r>
+      <w:r>
+        <w:rPr>
+          <w:lang w:val="en-IN"/>
+        </w:rPr>
+        <w:t xml:space="preserve">for CI/CD The idea of implementing a secure </w:t>
       </w:r>
       <w:proofErr w:type="spellStart"/>
       <w:r>
         <w:rPr>
           <w:lang w:val="en-IN"/>
         </w:rPr>
-        <w:t>DevSecOpspipeline</w:t>
+        <w:t>DevSecOps</w:t>
       </w:r>
       <w:proofErr w:type="spellEnd"/>
       <w:r>
         <w:rPr>
           <w:lang w:val="en-IN"/>
         </w:rPr>
-        <w:t xml:space="preserve"> that security measures are adopted throughout the development and implementation phases of software development and execution. Most </w:t>
+        <w:t xml:space="preserve"> </w:t>
+      </w:r>
+      <w:r>
+        <w:rPr>
+          <w:lang w:val="en-IN"/>
+        </w:rPr>
+        <w:t>pipeline that security measures are adopted throughout the development and implementation phases of software development and execution. Most DevOps</w:t>
+      </w:r>
+      <w:r>
+        <w:rPr>
+          <w:lang w:val="en-IN"/>
+        </w:rPr>
+        <w:t xml:space="preserve"> </w:t>
+      </w:r>
+      <w:r>
+        <w:rPr>
+          <w:lang w:val="en-IN"/>
+        </w:rPr>
+        <w:t xml:space="preserve">pipeline in the software industry performs security checks only at the end phase, unlike this </w:t>
       </w:r>
       <w:proofErr w:type="spellStart"/>
       <w:r>
         <w:rPr>
           <w:lang w:val="en-IN"/>
         </w:rPr>
-        <w:t>DevOpspipeline</w:t>
+        <w:t>DevSecOps</w:t>
       </w:r>
       <w:proofErr w:type="spellEnd"/>
       <w:r>
         <w:rPr>
           <w:lang w:val="en-IN"/>
         </w:rPr>
-        <w:t xml:space="preserve"> in the software industry performs security checks only at the end phase, unlike this </w:t>
-      </w:r>
-      <w:proofErr w:type="spellStart"/>
+        <w:t xml:space="preserve"> </w:t>
+      </w:r>
       <w:r>
         <w:rPr>
           <w:lang w:val="en-IN"/>
         </w:rPr>
-        <w:t>DevSecOpssystem</w:t>
-      </w:r>
-      <w:proofErr w:type="spellEnd"/>
-      <w:r>
-        <w:rPr>
-          <w:lang w:val="en-IN"/>
-        </w:rPr>
-        <w:t xml:space="preserve"> that adopts security checks throughout the lifecycle starting from the source code compilation to the runtime of the software which minimizes security threats and manual effort in the deployment of software.</w:t>
+        <w:t>system that adopts security checks throughout the lifecycle starting from the source code compilation to the runtime of the software which minimizes security threats and manual effort in the deployment of software.</w:t>
       </w:r>
     </w:p>
     <w:p>
@@ -1655,7 +1828,7 @@
           <w:noProof/>
         </w:rPr>
         <w:drawing>
-          <wp:inline distT="0" distB="0" distL="0" distR="0" wp14:anchorId="1714FD44" wp14:editId="2EECE9B8">
+          <wp:inline distT="0" distB="0" distL="0" distR="0" wp14:anchorId="1714FD44" wp14:editId="44F21173">
             <wp:extent cx="4108159" cy="1818005"/>
             <wp:effectExtent l="19050" t="19050" r="6985" b="0"/>
             <wp:docPr id="1518838053" name="Picture 2"/>
@@ -1687,7 +1860,7 @@
                   <pic:spPr bwMode="auto">
                     <a:xfrm>
                       <a:off x="0" y="0"/>
-                      <a:ext cx="4133658" cy="1829289"/>
+                      <a:ext cx="4108159" cy="1818005"/>
                     </a:xfrm>
                     <a:prstGeom prst="rect">
                       <a:avLst/>
@@ -1784,35 +1957,81 @@
         <w:rPr>
           <w:lang w:val="en-IN"/>
         </w:rPr>
-        <w:t xml:space="preserve"> represents a Jenkins pipeline workflow that starts when a developer commit code in a Git repository. Code commit initiates Jenkins pipeline for the entire workflow, which then calls SonarQube </w:t>
-      </w:r>
-      <w:proofErr w:type="spellStart"/>
+        <w:t xml:space="preserve"> represents a Jenkins pipeline workflow that starts when a developer commit code in a Git repository. Code </w:t>
+      </w:r>
+      <w:proofErr w:type="gramStart"/>
       <w:r>
         <w:rPr>
           <w:lang w:val="en-IN"/>
         </w:rPr>
-        <w:t>forStatic</w:t>
-      </w:r>
-      <w:proofErr w:type="spellEnd"/>
+        <w:t>commit</w:t>
+      </w:r>
+      <w:proofErr w:type="gramEnd"/>
       <w:r>
         <w:rPr>
           <w:lang w:val="en-IN"/>
         </w:rPr>
-        <w:t xml:space="preserve"> Application </w:t>
-      </w:r>
-      <w:proofErr w:type="spellStart"/>
+        <w:t xml:space="preserve"> initiates Jenkins pipeline for the entire workflow, which then calls SonarQube for</w:t>
+      </w:r>
       <w:r>
         <w:rPr>
           <w:lang w:val="en-IN"/>
         </w:rPr>
-        <w:t>SecurityTesting</w:t>
-      </w:r>
-      <w:proofErr w:type="spellEnd"/>
+        <w:t xml:space="preserve"> </w:t>
+      </w:r>
       <w:r>
         <w:rPr>
           <w:lang w:val="en-IN"/>
         </w:rPr>
-        <w:t>(SAST)to identify bug, code quality issues and security vulnerability in source code, If the code satisfy the defined quality gate then the application will compile and packaging then a docker image is build.</w:t>
+        <w:t>Static Application Security</w:t>
+      </w:r>
+      <w:r>
+        <w:rPr>
+          <w:lang w:val="en-IN"/>
+        </w:rPr>
+        <w:t xml:space="preserve"> </w:t>
+      </w:r>
+      <w:proofErr w:type="gramStart"/>
+      <w:r>
+        <w:rPr>
+          <w:lang w:val="en-IN"/>
+        </w:rPr>
+        <w:t>Testing(</w:t>
+      </w:r>
+      <w:proofErr w:type="gramEnd"/>
+      <w:r>
+        <w:rPr>
+          <w:lang w:val="en-IN"/>
+        </w:rPr>
+        <w:t xml:space="preserve">SAST)to identify bug, code quality issues and security vulnerability in source code, If the code </w:t>
+      </w:r>
+      <w:proofErr w:type="gramStart"/>
+      <w:r>
+        <w:rPr>
+          <w:lang w:val="en-IN"/>
+        </w:rPr>
+        <w:t>satisfy</w:t>
+      </w:r>
+      <w:proofErr w:type="gramEnd"/>
+      <w:r>
+        <w:rPr>
+          <w:lang w:val="en-IN"/>
+        </w:rPr>
+        <w:t xml:space="preserve"> the defined quality </w:t>
+      </w:r>
+      <w:proofErr w:type="gramStart"/>
+      <w:r>
+        <w:rPr>
+          <w:lang w:val="en-IN"/>
+        </w:rPr>
+        <w:t>gate</w:t>
+      </w:r>
+      <w:proofErr w:type="gramEnd"/>
+      <w:r>
+        <w:rPr>
+          <w:lang w:val="en-IN"/>
+        </w:rPr>
+        <w:t xml:space="preserve"> then the application will compile and packaging then a docker image is build.</w:t>
       </w:r>
     </w:p>
     <w:p>
@@ -1844,7 +2063,18 @@
         <w:t xml:space="preserve">       </w:t>
       </w:r>
       <w:r>
-        <w:t>Prometheus also enables the visibility needed in production by collecting resource usage metrics for services and system metrics such as system performance, memory usage etc.. These can be displayed in dashboards using Grafana, so operations can watch their applications run and trigger alerts in case of abnormal performance or failures in the systems running the software. With all of these features-static analysis, container security scanning, dynamic analysis, automated deployment, and continuous monitoring in place-this system provides an easy-to-implement solution for building secure, reliable, and continuously monitored delivery pipeline.</w:t>
+        <w:t xml:space="preserve">Prometheus also enables the visibility needed in production by collecting resource usage metrics for services and system metrics such as system performance, memory usage etc. </w:t>
+      </w:r>
+      <w:r>
+        <w:t xml:space="preserve">These can be visualized in dashboards through Grafana so that operations can monitor their applications and alert whenever there is a problem, either with performance or in the systems where the software runs. </w:t>
+      </w:r>
+      <w:proofErr w:type="gramStart"/>
+      <w:r>
+        <w:t>So</w:t>
+      </w:r>
+      <w:proofErr w:type="gramEnd"/>
+      <w:r>
+        <w:t xml:space="preserve"> with all static analysis, container security scanning, dynamic analysis, automatic deployment and monitoring in place we get a simple system to implement and have a fully monitored delivery pipeline.</w:t>
       </w:r>
     </w:p>
     <w:p>
@@ -1868,7 +2098,7 @@
         <w:jc w:val="both"/>
       </w:pPr>
       <w:r>
-        <w:t xml:space="preserve">This proposed </w:t>
+        <w:t xml:space="preserve">The proposed </w:t>
       </w:r>
       <w:proofErr w:type="spellStart"/>
       <w:r>
@@ -1876,7 +2106,7 @@
       </w:r>
       <w:proofErr w:type="spellEnd"/>
       <w:r>
-        <w:t xml:space="preserve"> framework automates security testing in the CI/CD pipeline, includes container security and automated deployment, and relies on continuous monitoring to create secure software. </w:t>
+        <w:t xml:space="preserve"> system can automate security tests in the CI/CD pipeline, manage container security and automated deployment and utilizes continuous monitoring to produce safe software. </w:t>
       </w:r>
       <w:proofErr w:type="spellStart"/>
       <w:r>
@@ -1884,7 +2114,10 @@
       </w:r>
       <w:proofErr w:type="spellEnd"/>
       <w:r>
-        <w:t xml:space="preserve"> has a step-by-step flow that relies on automation to handle individual steps in the SDLC as it processes the code.</w:t>
+        <w:t xml:space="preserve"> uses step-by-step automation flow that performs certain operations related to SDLC by processing the code</w:t>
+      </w:r>
+      <w:r>
+        <w:t>.</w:t>
       </w:r>
     </w:p>
     <w:p>
@@ -1896,7 +2129,10 @@
         <w:t xml:space="preserve">       </w:t>
       </w:r>
       <w:r>
-        <w:t>When a developer pushes their code to a Git repository, every code push will automatically trigger a Jenkins pipeline, usually through a webhook. This automation process ensures that each code change passes a certain validation procedure before being pushed to production. The entire pipeline is orchestrated by Jenkins as it executes all downstream stages in sequence, thus providing the automation pipeline the consistency that ensures reusability.</w:t>
+        <w:t>Whenever a developer makes a commit to a code base which then is pushed to a Git repository every single code push will by default trigger a Jenkins pipeline, usually via a webhook. This setup allows for a specific amount of quality control to take place for every code that is made before it is ready to be pushed to a production environment. The pipeline orchestration is done by Jenkins in the order of its down-stream steps, making the automation pipeline stable and reliable to reuse</w:t>
+      </w:r>
+      <w:r>
+        <w:t>.</w:t>
       </w:r>
     </w:p>
     <w:p>
@@ -1908,15 +2144,58 @@
         <w:t xml:space="preserve">       </w:t>
       </w:r>
       <w:r>
-        <w:t xml:space="preserve">The 1st step is security validation using SonarQube, doing Static Application Security Testing (SAST) on the source code. The source code of an application is analysed and inspected for bug issues, security vulnerability, code smells, duplicate code and maintainability. A quality Gate is used to make sure if the application </w:t>
-      </w:r>
-      <w:proofErr w:type="spellStart"/>
-      <w:r>
-        <w:t>fulfills</w:t>
-      </w:r>
-      <w:proofErr w:type="spellEnd"/>
-      <w:r>
-        <w:t xml:space="preserve"> all requirements for quality standards. If code passes the quality gates, then code moves to build.</w:t>
+        <w:t>Security validation in first step using SonarQube, it runs a SAST on source code of the application.</w:t>
+      </w:r>
+      <w:r>
+        <w:t xml:space="preserve"> </w:t>
+      </w:r>
+      <w:r>
+        <w:t>SAST is a testing technique that works on analysing source code and</w:t>
+      </w:r>
+      <w:r>
+        <w:t xml:space="preserve"> </w:t>
+      </w:r>
+      <w:r>
+        <w:t>inspecting it for</w:t>
+      </w:r>
+      <w:r>
+        <w:t xml:space="preserve"> </w:t>
+      </w:r>
+      <w:r>
+        <w:t>bugs, security vulnerabilities, code smell, duplication code and</w:t>
+      </w:r>
+      <w:r>
+        <w:t xml:space="preserve"> </w:t>
+      </w:r>
+      <w:r>
+        <w:t xml:space="preserve">maintainability. It gives us a quality </w:t>
+      </w:r>
+      <w:r>
+        <w:t>g</w:t>
+      </w:r>
+      <w:r>
+        <w:t>ate to ensure application passed for quality criteria. Once</w:t>
+      </w:r>
+      <w:r>
+        <w:t xml:space="preserve"> </w:t>
+      </w:r>
+      <w:r>
+        <w:t>code meets the</w:t>
+      </w:r>
+      <w:r>
+        <w:t xml:space="preserve"> Q</w:t>
+      </w:r>
+      <w:r>
+        <w:t>uality</w:t>
+      </w:r>
+      <w:r>
+        <w:t xml:space="preserve"> </w:t>
+      </w:r>
+      <w:r>
+        <w:t>Gates it can proceed to build stage</w:t>
+      </w:r>
+      <w:r>
+        <w:t>.</w:t>
       </w:r>
     </w:p>
     <w:p>
@@ -1928,7 +2207,7 @@
         <w:t xml:space="preserve">       </w:t>
       </w:r>
       <w:r>
-        <w:t xml:space="preserve">Once validation passes, Jenkins builds the application and creates it as a deployable artifact. We then build a container image for that artifact in order to make sure that the application will be executed in the same way no matter whether it’s development, testing, or production. Just before deployment, the container image is checked for potential vulnerabilities (using </w:t>
+        <w:t xml:space="preserve">If the validation succeeds, the application is built and prepared as a deployable artifact by Jenkins. Then the artifact is used to build a container image. This is to ensure the app is deployed with identical execution conditions regardless of the environment – be it development, testing or production. Immediately prior to deployment, the image undergoes vulnerability scans (with </w:t>
       </w:r>
       <w:proofErr w:type="spellStart"/>
       <w:r>
@@ -1936,7 +2215,10 @@
       </w:r>
       <w:proofErr w:type="spellEnd"/>
       <w:r>
-        <w:t>) and outdated packages, and, when serious issues are found, is stopped from moving on.</w:t>
+        <w:t>) for outdated software packages and if significant risks are discovered, the application is prevented from advancing</w:t>
+      </w:r>
+      <w:r>
+        <w:t>.</w:t>
       </w:r>
     </w:p>
     <w:p>
@@ -1948,15 +2230,29 @@
         <w:t xml:space="preserve">       </w:t>
       </w:r>
       <w:r>
-        <w:t xml:space="preserve">OWASP ZAP dynamically scans the application (DAST). Instead of looking for runtime vulnerabilities on the running application, DAST focuses on simulating user interaction to find security flaws that the application may exhibit at runtime, </w:t>
-      </w:r>
-      <w:proofErr w:type="spellStart"/>
-      <w:r>
-        <w:t>like:SQL</w:t>
-      </w:r>
-      <w:proofErr w:type="spellEnd"/>
-      <w:r>
-        <w:t xml:space="preserve"> injections Cross site scripting(XSS) Insecure Http headers Unauthenticated users The final layer in this security testing process is DAST.</w:t>
+        <w:t>OWASP ZAP dynamically scans the application (DAST). Instead of looking for runtime vulnerabilities on the running application, DAST focuses on simulating user interaction to find security flaws that the application may exhibit at runtime, like</w:t>
+      </w:r>
+      <w:r>
+        <w:t xml:space="preserve">. </w:t>
+      </w:r>
+      <w:r>
+        <w:t xml:space="preserve">SQL injections Cross site </w:t>
+      </w:r>
+      <w:proofErr w:type="gramStart"/>
+      <w:r>
+        <w:t>scripting(</w:t>
+      </w:r>
+      <w:proofErr w:type="gramEnd"/>
+      <w:r>
+        <w:t xml:space="preserve">XSS) Insecure Http headers Unauthenticated users </w:t>
+      </w:r>
+      <w:proofErr w:type="gramStart"/>
+      <w:r>
+        <w:t>The</w:t>
+      </w:r>
+      <w:proofErr w:type="gramEnd"/>
+      <w:r>
+        <w:t xml:space="preserve"> final layer in this security testing process is DAST.</w:t>
       </w:r>
     </w:p>
     <w:p>
@@ -3264,7 +3560,7 @@
           <w:noProof/>
         </w:rPr>
         <w:drawing>
-          <wp:inline distT="0" distB="0" distL="0" distR="0" wp14:anchorId="34FA85AE" wp14:editId="5086A58A">
+          <wp:inline distT="0" distB="0" distL="0" distR="0" wp14:anchorId="34FA85AE" wp14:editId="0686A06B">
             <wp:extent cx="4342862" cy="2264831"/>
             <wp:effectExtent l="19050" t="19050" r="635" b="2540"/>
             <wp:docPr id="995062764" name="Picture 4"/>
@@ -3296,7 +3592,7 @@
                   <pic:spPr bwMode="auto">
                     <a:xfrm>
                       <a:off x="0" y="0"/>
-                      <a:ext cx="4384518" cy="2286555"/>
+                      <a:ext cx="4342862" cy="2264831"/>
                     </a:xfrm>
                     <a:prstGeom prst="rect">
                       <a:avLst/>
@@ -3390,7 +3686,15 @@
         <w:t>.</w:t>
       </w:r>
       <w:r>
-        <w:t xml:space="preserve"> 3 indicates that Jenkins had performed all phases of the CI/CD pipeline, source code check out, installing dependency, application build, static code analysis, testing and Quality Gate validation, that meant all the phases completed successfully. From which, we can come to conclusion that the pipeline developed has been used to automate the software delivery, without human involvement and that security measures had been checked at all phases of the Software Development lifecycle.</w:t>
+        <w:t xml:space="preserve"> 3 indicates that Jenkins had performed all phases of the CI/CD pipeline, source code </w:t>
+      </w:r>
+      <w:proofErr w:type="gramStart"/>
+      <w:r>
+        <w:t>check</w:t>
+      </w:r>
+      <w:proofErr w:type="gramEnd"/>
+      <w:r>
+        <w:t xml:space="preserve"> out, installing dependency, application build, static code analysis, testing and Quality Gate validation, that meant all the phases completed successfully. From which, we can come to conclusion that the pipeline developed has been used to automate the software delivery, without human involvement and that security measures had been checked at all phases of the Software Development lifecycle.</w:t>
       </w:r>
     </w:p>
     <w:tbl>
@@ -3805,8 +4109,8 @@
         <w:tblLook w:val="04A0" w:firstRow="1" w:lastRow="0" w:firstColumn="1" w:lastColumn="0" w:noHBand="0" w:noVBand="1"/>
       </w:tblPr>
       <w:tblGrid>
-        <w:gridCol w:w="4541"/>
-        <w:gridCol w:w="4463"/>
+        <w:gridCol w:w="4532"/>
+        <w:gridCol w:w="4472"/>
       </w:tblGrid>
       <w:tr>
         <w:tc>
@@ -3827,9 +4131,9 @@
                 <w:lang w:val="en-IN"/>
               </w:rPr>
               <w:drawing>
-                <wp:inline distT="0" distB="0" distL="0" distR="0" wp14:anchorId="5EF45EFC" wp14:editId="6D9F5D52">
+                <wp:inline distT="0" distB="0" distL="0" distR="0" wp14:anchorId="5EF45EFC" wp14:editId="34E4B49F">
                   <wp:extent cx="2780328" cy="1627505"/>
-                  <wp:effectExtent l="19050" t="19050" r="1270" b="0"/>
+                  <wp:effectExtent l="19050" t="19050" r="0" b="5080"/>
                   <wp:docPr id="1260153653" name="Picture 10"/>
                   <wp:cNvGraphicFramePr>
                     <a:graphicFrameLocks xmlns:a="http://schemas.openxmlformats.org/drawingml/2006/main" noChangeAspect="1"/>
@@ -3856,7 +4160,7 @@
                         <pic:spPr>
                           <a:xfrm>
                             <a:off x="0" y="0"/>
-                            <a:ext cx="2826658" cy="1654625"/>
+                            <a:ext cx="2780328" cy="1627505"/>
                           </a:xfrm>
                           <a:prstGeom prst="rect">
                             <a:avLst/>
@@ -3959,9 +4263,9 @@
                 <w:lang w:val="en-IN"/>
               </w:rPr>
               <w:drawing>
-                <wp:inline distT="0" distB="0" distL="0" distR="0" wp14:anchorId="43CF98F2" wp14:editId="5842B5C0">
+                <wp:inline distT="0" distB="0" distL="0" distR="0" wp14:anchorId="43CF98F2" wp14:editId="67C2BD4A">
                   <wp:extent cx="2731206" cy="1627505"/>
-                  <wp:effectExtent l="19050" t="19050" r="0" b="0"/>
+                  <wp:effectExtent l="19050" t="19050" r="9525" b="5080"/>
                   <wp:docPr id="1839239513" name="Picture 11"/>
                   <wp:cNvGraphicFramePr>
                     <a:graphicFrameLocks xmlns:a="http://schemas.openxmlformats.org/drawingml/2006/main" noChangeAspect="1"/>
@@ -3988,7 +4292,7 @@
                         <pic:spPr>
                           <a:xfrm>
                             <a:off x="0" y="0"/>
-                            <a:ext cx="2798252" cy="1667457"/>
+                            <a:ext cx="2731206" cy="1627505"/>
                           </a:xfrm>
                           <a:prstGeom prst="rect">
                             <a:avLst/>
@@ -4011,16 +4315,11 @@
               <w:tabs>
                 <w:tab w:val="left" w:pos="1469"/>
               </w:tabs>
+              <w:jc w:val="center"/>
               <w:rPr>
                 <w:lang w:val="en-IN"/>
               </w:rPr>
             </w:pPr>
-            <w:r>
-              <w:rPr>
-                <w:lang w:val="en-IN"/>
-              </w:rPr>
-              <w:tab/>
-            </w:r>
             <w:r>
               <w:rPr>
                 <w:rFonts w:eastAsia="MS Mincho"/>
@@ -4126,24 +4425,38 @@
         </w:rPr>
       </w:pPr>
       <w:r>
-        <w:rPr>
-          <w:lang w:val="en-IN"/>
-        </w:rPr>
-        <w:t xml:space="preserve">Looking at earlier studies, most of them zeroed in on one or two parts of the pipeline — some focused purely on static code analysis, others only tested after deployment was already done. Security ended up being handled in patches rather than as something that ran through the whole process </w:t>
+        <w:t>By going back and looking at prior research, the overwhelming majority had tunnel vision in the pipeline, focusing on one or two of the key sections</w:t>
+      </w:r>
+      <w:r>
+        <w:t>. Some</w:t>
+      </w:r>
+      <w:r>
+        <w:t xml:space="preserve"> work looked solely at static code inspection</w:t>
+      </w:r>
+      <w:r>
+        <w:t>. O</w:t>
+      </w:r>
+      <w:r>
+        <w:t>thers tested after an application was deployed to production</w:t>
+      </w:r>
+      <w:r>
+        <w:t>. Security</w:t>
+      </w:r>
+      <w:r>
+        <w:t xml:space="preserve"> tended to come in as something of an add-on, or as a series of individual, reactive patches to security issues, rather than something integrated through the entire process. The pipeline utilized in this research, covering three critical stages (</w:t>
       </w:r>
       <w:proofErr w:type="spellStart"/>
-      <w:r>
-        <w:rPr>
-          <w:lang w:val="en-IN"/>
-        </w:rPr>
-        <w:t>consistently.The</w:t>
+      <w:proofErr w:type="gramStart"/>
+      <w:r>
+        <w:t>code,container</w:t>
+      </w:r>
+      <w:proofErr w:type="gramEnd"/>
+      <w:r>
+        <w:t>,post</w:t>
       </w:r>
       <w:proofErr w:type="spellEnd"/>
       <w:r>
-        <w:rPr>
-          <w:lang w:val="en-IN"/>
-        </w:rPr>
-        <w:t xml:space="preserve"> pipeline in this work covers all three levels — code, container, and post-deployment — which means security gets a look-in at each meaningful point rather than just one. That shift alone changes how vulnerabilities get caught and dealt with.</w:t>
+        <w:t>-deployment), helps integrate security at every logical point within the CI/CD pipeline, which has significant implications on what vulnerabilities can be found and remediated.</w:t>
       </w:r>
     </w:p>
     <w:p>
@@ -4155,24 +4468,19 @@
         </w:rPr>
       </w:pPr>
       <w:r>
+        <w:t xml:space="preserve">One other pattern that </w:t>
+      </w:r>
+      <w:r>
+        <w:t>we</w:t>
+      </w:r>
+      <w:r>
+        <w:t xml:space="preserve"> observed with previous work is the complete lack of any post-deployment monitoring. Many solutions have just been shipped to the product team once development was “complete” This work takes things a step beyond, with Prometheus and Grafana still being alive to allow us to monitor the system when it is being used in the real world. By stringing the stages together, rather than considering them separately we remove opportunities for gaps and avoid many unpleasant surprises. A comparison is made of present and proposed models in Table II below</w:t>
+      </w:r>
+      <w:r>
         <w:rPr>
           <w:lang w:val="en-IN"/>
         </w:rPr>
-        <w:t xml:space="preserve">Something else that stood out in prior work was the absence of any monitoring after deployment. A lot of implementations simply stopped once the application went live. This work keeps going beyond that point, with Prometheus and Grafana staying active so the system can be watched while it is actually in </w:t>
-      </w:r>
-      <w:proofErr w:type="spellStart"/>
-      <w:r>
-        <w:rPr>
-          <w:lang w:val="en-IN"/>
-        </w:rPr>
-        <w:t>use.Stringing</w:t>
-      </w:r>
-      <w:proofErr w:type="spellEnd"/>
-      <w:r>
-        <w:rPr>
-          <w:lang w:val="en-IN"/>
-        </w:rPr>
-        <w:t xml:space="preserve"> these stages together rather than treating them in isolation is what makes the difference — fewer gaps, fewer surprises, and less room for something to quietly go wrong. A side-by-side comparison of existing and proposed approaches is laid out in Table II below.</w:t>
+        <w:t>.</w:t>
       </w:r>
     </w:p>
     <w:p>
@@ -5177,7 +5485,21 @@
         <w:rPr>
           <w:lang w:val="en-GB"/>
         </w:rPr>
-        <w:t xml:space="preserve">, “DevOps Integration With Capability Model Maturity Integration: A Systematic Mapping Review,” </w:t>
+        <w:t xml:space="preserve">, “DevOps Integration </w:t>
+      </w:r>
+      <w:proofErr w:type="gramStart"/>
+      <w:r>
+        <w:rPr>
+          <w:lang w:val="en-GB"/>
+        </w:rPr>
+        <w:t>With</w:t>
+      </w:r>
+      <w:proofErr w:type="gramEnd"/>
+      <w:r>
+        <w:rPr>
+          <w:lang w:val="en-GB"/>
+        </w:rPr>
+        <w:t xml:space="preserve"> Capability Model Maturity Integration: A Systematic Mapping Review,” </w:t>
       </w:r>
       <w:r>
         <w:rPr>
@@ -6252,6 +6574,7 @@
   <w:style w:type="character" w:default="1" w:styleId="DefaultParagraphFont">
     <w:name w:val="Default Paragraph Font"/>
     <w:uiPriority w:val="1"/>
+    <w:semiHidden/>
     <w:unhideWhenUsed/>
   </w:style>
   <w:style w:type="table" w:default="1" w:styleId="TableNormal">

</xml_diff>

<commit_message>
updated  with Correct Figure
</commit_message>
<xml_diff>
--- a/Documentation/Main Paper/Research.docx
+++ b/Documentation/Main Paper/Research.docx
@@ -745,7 +745,7 @@
           <w:noProof/>
         </w:rPr>
         <w:drawing>
-          <wp:inline distT="0" distB="0" distL="0" distR="0" wp14:anchorId="0073B82B" wp14:editId="6D8A3ADC">
+          <wp:inline distT="0" distB="0" distL="0" distR="0" wp14:anchorId="0073B82B" wp14:editId="694D6E0D">
             <wp:extent cx="1665983" cy="1530930"/>
             <wp:effectExtent l="19050" t="19050" r="0" b="0"/>
             <wp:docPr id="1247418512" name="Picture 5"/>
@@ -3223,7 +3223,7 @@
                 <w:noProof/>
               </w:rPr>
               <w:drawing>
-                <wp:inline distT="0" distB="0" distL="0" distR="0" wp14:anchorId="151A6A3D" wp14:editId="24DA80C1">
+                <wp:inline distT="0" distB="0" distL="0" distR="0" wp14:anchorId="151A6A3D" wp14:editId="797A70FC">
                   <wp:extent cx="2659601" cy="2009002"/>
                   <wp:effectExtent l="19050" t="19050" r="7620" b="0"/>
                   <wp:docPr id="1676718502" name="Picture 8"/>
@@ -3574,7 +3574,7 @@
                 <w:lang w:val="en-IN"/>
               </w:rPr>
               <w:drawing>
-                <wp:inline distT="0" distB="0" distL="0" distR="0" wp14:anchorId="5EF45EFC" wp14:editId="212F0B8A">
+                <wp:inline distT="0" distB="0" distL="0" distR="0" wp14:anchorId="5EF45EFC" wp14:editId="2D2B842D">
                   <wp:extent cx="2780328" cy="1627505"/>
                   <wp:effectExtent l="19050" t="19050" r="0" b="5080"/>
                   <wp:docPr id="1260153653" name="Picture 10"/>
@@ -3793,7 +3793,7 @@
                 <w:sz w:val="16"/>
                 <w:szCs w:val="16"/>
               </w:rPr>
-              <w:t>5</w:t>
+              <w:t>7</w:t>
             </w:r>
             <w:r>
               <w:rPr>
@@ -5788,6 +5788,7 @@
   <w:style w:type="character" w:default="1" w:styleId="DefaultParagraphFont">
     <w:name w:val="Default Paragraph Font"/>
     <w:uiPriority w:val="1"/>
+    <w:semiHidden/>
     <w:unhideWhenUsed/>
   </w:style>
   <w:style w:type="table" w:default="1" w:styleId="TableNormal">

</xml_diff>

<commit_message>
Fix email formatting and improve abstract clarity in Research.docx
</commit_message>
<xml_diff>
--- a/Documentation/Main Paper/Research.docx
+++ b/Documentation/Main Paper/Research.docx
@@ -1,6 +1,6 @@
 
 <file path=word/document.xml><?xml version="1.0" encoding="utf-8"?>
-<w:document xmlns:wpc="http://schemas.microsoft.com/office/word/2010/wordprocessingCanvas" xmlns:cx="http://schemas.microsoft.com/office/drawing/2014/chartex" xmlns:cx1="http://schemas.microsoft.com/office/drawing/2015/9/8/chartex" xmlns:cx2="http://schemas.microsoft.com/office/drawing/2015/10/21/chartex" xmlns:cx3="http://schemas.microsoft.com/office/drawing/2016/5/9/chartex" xmlns:cx4="http://schemas.microsoft.com/office/drawing/2016/5/10/chartex" xmlns:cx5="http://schemas.microsoft.com/office/drawing/2016/5/11/chartex" xmlns:cx6="http://schemas.microsoft.com/office/drawing/2016/5/12/chartex" xmlns:cx7="http://schemas.microsoft.com/office/drawing/2016/5/13/chartex" xmlns:cx8="http://schemas.microsoft.com/office/drawing/2016/5/14/chartex" xmlns:mc="http://schemas.openxmlformats.org/markup-compatibility/2006" xmlns:aink="http://schemas.microsoft.com/office/drawing/2016/ink" xmlns:am3d="http://schemas.microsoft.com/office/drawing/2017/model3d" xmlns:o="urn:schemas-microsoft-com:office:office" xmlns:oel="http://schemas.microsoft.com/office/2019/extlst" xmlns:r="http://schemas.openxmlformats.org/officeDocument/2006/relationships" xmlns:m="http://schemas.openxmlformats.org/officeDocument/2006/math" xmlns:v="urn:schemas-microsoft-com:vml" xmlns:wp14="http://schemas.microsoft.com/office/word/2010/wordprocessingDrawing" xmlns:wp="http://schemas.openxmlformats.org/drawingml/2006/wordprocessingDrawing" xmlns:w10="urn:schemas-microsoft-com:office:word" xmlns:w="http://schemas.openxmlformats.org/wordprocessingml/2006/main" xmlns:w14="http://schemas.microsoft.com/office/word/2010/wordml" xmlns:w15="http://schemas.microsoft.com/office/word/2012/wordml" xmlns:w16cex="http://schemas.microsoft.com/office/word/2018/wordml/cex" xmlns:w16cid="http://schemas.microsoft.com/office/word/2016/wordml/cid" xmlns:w16="http://schemas.microsoft.com/office/word/2018/wordml" xmlns:w16du="http://schemas.microsoft.com/office/word/2023/wordml/word16du" xmlns:w16sdtdh="http://schemas.microsoft.com/office/word/2020/wordml/sdtdatahash" xmlns:w16sdtfl="http://schemas.microsoft.com/office/word/2024/wordml/sdtformatlock" xmlns:w16se="http://schemas.microsoft.com/office/word/2015/wordml/symex" xmlns:wpg="http://schemas.microsoft.com/office/word/2010/wordprocessingGroup" xmlns:wpi="http://schemas.microsoft.com/office/word/2010/wordprocessingInk" xmlns:wne="http://schemas.microsoft.com/office/word/2006/wordml" xmlns:wps="http://schemas.microsoft.com/office/word/2010/wordprocessingShape" mc:Ignorable="w14 w15 w16se w16cid w16 w16cex w16sdtdh w16sdtfl w16du wp14">
+<w:document xmlns:wpc="http://schemas.microsoft.com/office/word/2010/wordprocessingCanvas" xmlns:cx="http://schemas.microsoft.com/office/drawing/2014/chartex" xmlns:cx1="http://schemas.microsoft.com/office/drawing/2015/9/8/chartex" xmlns:cx2="http://schemas.microsoft.com/office/drawing/2015/10/21/chartex" xmlns:cx3="http://schemas.microsoft.com/office/drawing/2016/5/9/chartex" xmlns:cx4="http://schemas.microsoft.com/office/drawing/2016/5/10/chartex" xmlns:cx5="http://schemas.microsoft.com/office/drawing/2016/5/11/chartex" xmlns:cx6="http://schemas.microsoft.com/office/drawing/2016/5/12/chartex" xmlns:cx7="http://schemas.microsoft.com/office/drawing/2016/5/13/chartex" xmlns:cx8="http://schemas.microsoft.com/office/drawing/2016/5/14/chartex" xmlns:mc="http://schemas.openxmlformats.org/markup-compatibility/2006" xmlns:aink="http://schemas.microsoft.com/office/drawing/2016/ink" xmlns:am3d="http://schemas.microsoft.com/office/drawing/2017/model3d" xmlns:o="urn:schemas-microsoft-com:office:office" xmlns:oel="http://schemas.microsoft.com/office/2019/extlst" xmlns:r="http://schemas.openxmlformats.org/officeDocument/2006/relationships" xmlns:m="http://schemas.openxmlformats.org/officeDocument/2006/math" xmlns:v="urn:schemas-microsoft-com:vml" xmlns:wp14="http://schemas.microsoft.com/office/word/2010/wordprocessingDrawing" xmlns:wp="http://schemas.openxmlformats.org/drawingml/2006/wordprocessingDrawing" xmlns:w10="urn:schemas-microsoft-com:office:word" xmlns:w="http://schemas.openxmlformats.org/wordprocessingml/2006/main" xmlns:w14="http://schemas.microsoft.com/office/word/2010/wordml" xmlns:w15="http://schemas.microsoft.com/office/word/2012/wordml" xmlns:w16cei="http://schemas.microsoft.com/office/word/2026/wordml/cei" xmlns:w16cex="http://schemas.microsoft.com/office/word/2018/wordml/cex" xmlns:w16cid="http://schemas.microsoft.com/office/word/2016/wordml/cid" xmlns:w16="http://schemas.microsoft.com/office/word/2018/wordml" xmlns:w16du="http://schemas.microsoft.com/office/word/2023/wordml/word16du" xmlns:w16sdtdh="http://schemas.microsoft.com/office/word/2020/wordml/sdtdatahash" xmlns:w16sdtfl="http://schemas.microsoft.com/office/word/2024/wordml/sdtformatlock" xmlns:w16se="http://schemas.microsoft.com/office/word/2015/wordml/symex" xmlns:wpg="http://schemas.microsoft.com/office/word/2010/wordprocessingGroup" xmlns:wpi="http://schemas.microsoft.com/office/word/2010/wordprocessingInk" xmlns:wne="http://schemas.microsoft.com/office/word/2006/wordml" xmlns:wps="http://schemas.microsoft.com/office/word/2010/wordprocessingShape" mc:Ignorable="w14 w15 w16se w16cid w16 w16cex w16sdtdh w16sdtfl w16du wp14">
   <w:body>
     <w:tbl>
       <w:tblPr>
@@ -88,8 +88,36 @@
           <w:szCs w:val="40"/>
           <w:lang w:val="en-GB"/>
         </w:rPr>
-        <w:t>Building Security Into Every Stage of the CI/CD Using DevSecOps</w:t>
-      </w:r>
+        <w:t xml:space="preserve">Building Security </w:t>
+      </w:r>
+      <w:proofErr w:type="gramStart"/>
+      <w:r>
+        <w:rPr>
+          <w:sz w:val="40"/>
+          <w:szCs w:val="40"/>
+          <w:lang w:val="en-GB"/>
+        </w:rPr>
+        <w:t>Into</w:t>
+      </w:r>
+      <w:proofErr w:type="gramEnd"/>
+      <w:r>
+        <w:rPr>
+          <w:sz w:val="40"/>
+          <w:szCs w:val="40"/>
+          <w:lang w:val="en-GB"/>
+        </w:rPr>
+        <w:t xml:space="preserve"> Every Stage of the CI/CD Using </w:t>
+      </w:r>
+      <w:proofErr w:type="spellStart"/>
+      <w:r>
+        <w:rPr>
+          <w:sz w:val="40"/>
+          <w:szCs w:val="40"/>
+          <w:lang w:val="en-GB"/>
+        </w:rPr>
+        <w:t>DevSecOps</w:t>
+      </w:r>
+      <w:proofErr w:type="spellEnd"/>
     </w:p>
     <w:p>
       <w:pPr>
@@ -261,6 +289,7 @@
         </w:rPr>
         <w:t xml:space="preserve">Email: </w:t>
       </w:r>
+      <w:proofErr w:type="gramStart"/>
       <w:r>
         <w:rPr>
           <w:rFonts w:eastAsia="MS Mincho"/>
@@ -281,13 +310,21 @@
           <w:iCs/>
           <w:lang w:val="en-IN"/>
         </w:rPr>
-        <w:t>revanthkumarts123</w:t>
-      </w:r>
+        <w:t>revanthkumarts</w:t>
+      </w:r>
+      <w:proofErr w:type="gramEnd"/>
       <w:r>
         <w:rPr>
           <w:iCs/>
           <w:lang w:val="en-IN"/>
         </w:rPr>
+        <w:t>123</w:t>
+      </w:r>
+      <w:r>
+        <w:rPr>
+          <w:iCs/>
+          <w:lang w:val="en-IN"/>
+        </w:rPr>
         <w:t>,</w:t>
       </w:r>
       <w:r>
@@ -297,6 +334,7 @@
         </w:rPr>
         <w:t xml:space="preserve"> </w:t>
       </w:r>
+      <w:proofErr w:type="spellStart"/>
       <w:r>
         <w:rPr>
           <w:iCs/>
@@ -304,6 +342,7 @@
         </w:rPr>
         <w:t>sankethcoding</w:t>
       </w:r>
+      <w:proofErr w:type="spellEnd"/>
       <w:r>
         <w:rPr>
           <w:rFonts w:eastAsia="MS Mincho"/>
@@ -347,6 +386,12 @@
       </w:r>
       <w:r>
         <w:rPr>
+          <w:iCs/>
+        </w:rPr>
+        <w:t xml:space="preserve"> </w:t>
+      </w:r>
+      <w:r>
+        <w:rPr>
           <w:rFonts w:eastAsia="MS Mincho"/>
           <w:sz w:val="18"/>
           <w:szCs w:val="18"/>
@@ -426,28 +471,56 @@
           <w:sz w:val="18"/>
           <w:szCs w:val="18"/>
         </w:rPr>
-        <w:t>Email: {</w:t>
-      </w:r>
-      <w:r>
-        <w:rPr>
-          <w:iCs/>
-        </w:rPr>
-        <w:t>sameena.hs</w:t>
-      </w:r>
+        <w:t xml:space="preserve">Email: </w:t>
+      </w:r>
+      <w:proofErr w:type="gramStart"/>
       <w:r>
         <w:rPr>
           <w:rFonts w:eastAsia="MS Mincho"/>
           <w:sz w:val="18"/>
           <w:szCs w:val="18"/>
         </w:rPr>
+        <w:t>{</w:t>
+      </w:r>
+      <w:r>
+        <w:rPr>
+          <w:rFonts w:eastAsia="MS Mincho"/>
+          <w:sz w:val="18"/>
+          <w:szCs w:val="18"/>
+        </w:rPr>
+        <w:t xml:space="preserve"> </w:t>
+      </w:r>
+      <w:proofErr w:type="spellStart"/>
+      <w:r>
+        <w:rPr>
+          <w:iCs/>
+        </w:rPr>
+        <w:t>sameena</w:t>
+      </w:r>
+      <w:proofErr w:type="gramEnd"/>
+      <w:r>
+        <w:rPr>
+          <w:iCs/>
+        </w:rPr>
+        <w:t>.hs</w:t>
+      </w:r>
+      <w:proofErr w:type="spellEnd"/>
+      <w:r>
+        <w:rPr>
+          <w:rFonts w:eastAsia="MS Mincho"/>
+          <w:sz w:val="18"/>
+          <w:szCs w:val="18"/>
+        </w:rPr>
         <w:t xml:space="preserve">, </w:t>
       </w:r>
+      <w:proofErr w:type="spellStart"/>
       <w:r>
         <w:rPr>
           <w:iCs/>
         </w:rPr>
         <w:t>cashwini</w:t>
       </w:r>
+      <w:proofErr w:type="spellEnd"/>
       <w:r>
         <w:rPr>
           <w:rFonts w:eastAsia="MS Mincho"/>
@@ -531,7 +604,21 @@
         <w:rPr>
           <w:szCs w:val="18"/>
         </w:rPr>
-        <w:t>DevOps helped to advance software delivery using a blend of development and operation practices, to provide faster and more dependable releases. Security was still usually perceived as an after thought towards the end of software development, therefore problems with security are only uncovered toward the end. DevSecOps tries to improve on this by embedding security within the different steps of the CI/CD pipeline.</w:t>
+        <w:t xml:space="preserve">DevOps helped to advance software delivery using a blend of development and operation practices, to provide faster and more dependable releases. Security was still usually perceived as an afterthought towards the end of software development, therefore problems with security are only uncovered toward the end. </w:t>
+      </w:r>
+      <w:proofErr w:type="spellStart"/>
+      <w:r>
+        <w:rPr>
+          <w:szCs w:val="18"/>
+        </w:rPr>
+        <w:t>DevSecOps</w:t>
+      </w:r>
+      <w:proofErr w:type="spellEnd"/>
+      <w:r>
+        <w:rPr>
+          <w:szCs w:val="18"/>
+        </w:rPr>
+        <w:t xml:space="preserve"> tries to improve on this by embedding security within the different steps of the CI/CD pipeline.</w:t>
       </w:r>
     </w:p>
     <w:p>
@@ -546,7 +633,48 @@
         <w:rPr>
           <w:szCs w:val="18"/>
         </w:rPr>
-        <w:t>This paper presents a secured DevSecOps pipeline using Git &amp; Jenkins for CI, SonarQube for Static Code Analysis, Trivy for Container Security Scanning, OWASP ZAP for Dynamic Application Security Testing, Docker &amp; Kubernetes for containerized deployment and Prometheus &amp; Grafana for monitoring. The presented pipeline automates security verification right from the source code level to the runtime, which detects security vulnerabilities in prior to production deployment while ensuring Continuous Delivery of software.</w:t>
+        <w:t xml:space="preserve">This paper presents a secured </w:t>
+      </w:r>
+      <w:proofErr w:type="spellStart"/>
+      <w:r>
+        <w:rPr>
+          <w:szCs w:val="18"/>
+        </w:rPr>
+        <w:t>DevSecOps</w:t>
+      </w:r>
+      <w:proofErr w:type="spellEnd"/>
+      <w:r>
+        <w:rPr>
+          <w:szCs w:val="18"/>
+        </w:rPr>
+        <w:t xml:space="preserve"> pipeline using Git &amp; Jenkins for CI, SonarQube for Static Code Analysis, </w:t>
+      </w:r>
+      <w:proofErr w:type="spellStart"/>
+      <w:r>
+        <w:rPr>
+          <w:szCs w:val="18"/>
+        </w:rPr>
+        <w:t>Trivy</w:t>
+      </w:r>
+      <w:proofErr w:type="spellEnd"/>
+      <w:r>
+        <w:rPr>
+          <w:szCs w:val="18"/>
+        </w:rPr>
+        <w:t xml:space="preserve"> for Container Security Scanning, OWASP ZAP for Dynamic Application Security Testing, Docker &amp; Kubernetes for containerized deployment and Prometheus &amp; Grafana for monitoring. The presented pipeline automates security verification right from the source code level to the runtime, which </w:t>
+      </w:r>
+      <w:r>
+        <w:rPr>
+          <w:szCs w:val="18"/>
+          <w:lang w:val="en-GB"/>
+        </w:rPr>
+        <w:t>detects security vulnerabilities before production deployment</w:t>
+      </w:r>
+      <w:r>
+        <w:rPr>
+          <w:szCs w:val="18"/>
+        </w:rPr>
+        <w:t xml:space="preserve"> while ensuring Continuous Delivery of software.</w:t>
       </w:r>
     </w:p>
     <w:p>
@@ -607,13 +735,31 @@
         </w:rPr>
         <w:t xml:space="preserve"> </w:t>
       </w:r>
+      <w:proofErr w:type="spellStart"/>
       <w:r>
         <w:rPr>
           <w:b/>
           <w:sz w:val="18"/>
           <w:szCs w:val="18"/>
         </w:rPr>
-        <w:t>DevSecOps, CI/CD Pipeline, Static Application Security Testing (SAST), Dynamic Application Security Testing (DAST), Container Security, Continuous Monitoring</w:t>
+        <w:t>DevSecOps</w:t>
+      </w:r>
+      <w:proofErr w:type="spellEnd"/>
+      <w:r>
+        <w:rPr>
+          <w:b/>
+          <w:sz w:val="18"/>
+          <w:szCs w:val="18"/>
+        </w:rPr>
+        <w:t>, CI/CD Pipeline, Static Application Security Testing (SAST), Dynamic Application Security Testing (DAST), Container Security, Continuous Monitoring</w:t>
+      </w:r>
+      <w:r>
+        <w:rPr>
+          <w:b/>
+          <w:sz w:val="18"/>
+          <w:szCs w:val="18"/>
+        </w:rPr>
+        <w:t>.</w:t>
       </w:r>
     </w:p>
     <w:p>
@@ -702,11 +848,41 @@
         <w:t xml:space="preserve">As such systems became more prevalent, however, vulnerabilities in their architecture started appearing. </w:t>
       </w:r>
       <w:r>
-        <w:t xml:space="preserve">Before DevSecOps existed, the security tests were being performed during the last stages of software </w:t>
+        <w:t xml:space="preserve">Before </w:t>
+      </w:r>
+      <w:proofErr w:type="spellStart"/>
+      <w:r>
+        <w:t>DevSecOps</w:t>
+      </w:r>
+      <w:proofErr w:type="spellEnd"/>
+      <w:r>
+        <w:t xml:space="preserve"> existed, the security tests were being performed during the last stages of software </w:t>
       </w:r>
       <w:r>
         <w:lastRenderedPageBreak/>
-        <w:t>development just before it was being released. This was a bad way of working however it was acceptable at the time because there were only a handful of new releases a couple of times per month. However, as the rate of releases into production was being pushed to one or several times per day, or per hour, it was no longer acceptable to be performed tests between the new releases and the new release. This generated serious problems if a bug is discovered weeks after the development has been undertaken then it can be very complex to find a suitable fix, and also the fix could also have consequences to both business and technical decisions that would have been made at the beginning of the development. DevSecOps was born because software developers and IT professional were facing many of these problems its basic underlying rule is that there cannot be security added to something that did not had it from the very first day</w:t>
+        <w:t xml:space="preserve">development just before it was being released. This was a bad way of working however it was acceptable at the time because there were only a handful of new releases a couple of times per month. However, as the rate of releases into production was being pushed to one or several times per day, or per hour, it was no longer acceptable to be performed tests between the new releases and the new release. This generated serious problems if a bug is discovered weeks after the development has been undertaken then it can be very complex to find a suitable fix, and also the fix could also have consequences to both business and technical decisions that would have been made at the beginning of the development. </w:t>
+      </w:r>
+      <w:proofErr w:type="spellStart"/>
+      <w:r>
+        <w:t>DevSecOps</w:t>
+      </w:r>
+      <w:proofErr w:type="spellEnd"/>
+      <w:r>
+        <w:t xml:space="preserve"> was born because software developers and IT professional</w:t>
+      </w:r>
+      <w:r>
+        <w:t>s</w:t>
+      </w:r>
+      <w:r>
+        <w:t xml:space="preserve"> were facing many of these problems its basic underlying rule is that there cannot be security added to something that did not </w:t>
+      </w:r>
+      <w:proofErr w:type="gramStart"/>
+      <w:r>
+        <w:t>had</w:t>
+      </w:r>
+      <w:proofErr w:type="gramEnd"/>
+      <w:r>
+        <w:t xml:space="preserve"> it from the very first day</w:t>
       </w:r>
       <w:r>
         <w:t>.</w:t>
@@ -745,7 +921,7 @@
           <w:noProof/>
         </w:rPr>
         <w:drawing>
-          <wp:inline distT="0" distB="0" distL="0" distR="0" wp14:anchorId="0073B82B" wp14:editId="694D6E0D">
+          <wp:inline distT="0" distB="0" distL="0" distR="0" wp14:anchorId="0073B82B" wp14:editId="0040770D">
             <wp:extent cx="1665983" cy="1530930"/>
             <wp:effectExtent l="19050" t="19050" r="0" b="0"/>
             <wp:docPr id="1247418512" name="Picture 5"/>
@@ -899,7 +1075,21 @@
         <w:rPr>
           <w:lang w:val="en-IN"/>
         </w:rPr>
-        <w:t xml:space="preserve"> 1 illustrates the relationship between the three key components of DevSecOps. </w:t>
+        <w:t xml:space="preserve"> 1 illustrates the relationship between the three key components of </w:t>
+      </w:r>
+      <w:proofErr w:type="spellStart"/>
+      <w:r>
+        <w:rPr>
+          <w:lang w:val="en-IN"/>
+        </w:rPr>
+        <w:t>DevSecOps</w:t>
+      </w:r>
+      <w:proofErr w:type="spellEnd"/>
+      <w:r>
+        <w:rPr>
+          <w:lang w:val="en-IN"/>
+        </w:rPr>
+        <w:t xml:space="preserve">. </w:t>
       </w:r>
       <w:r>
         <w:rPr>
@@ -923,7 +1113,21 @@
         <w:rPr>
           <w:lang w:val="en-GB"/>
         </w:rPr>
-        <w:t>Security segment scans, threat identification and controls in place to reduce their impact. From the figure above there is no ordering all three happens in unison and impacts on each other. The essence is if any of the three segments are taken in separation the concept DevSecOps doesn't remain applicable.</w:t>
+        <w:t xml:space="preserve">Security segment scans, threat identification and controls in place to reduce their impact. From the figure above there is no ordering all three happens in unison and impacts on each other. The essence is if any of the three segments are taken in separation the concept </w:t>
+      </w:r>
+      <w:proofErr w:type="spellStart"/>
+      <w:r>
+        <w:rPr>
+          <w:lang w:val="en-GB"/>
+        </w:rPr>
+        <w:t>DevSecOps</w:t>
+      </w:r>
+      <w:proofErr w:type="spellEnd"/>
+      <w:r>
+        <w:rPr>
+          <w:lang w:val="en-GB"/>
+        </w:rPr>
+        <w:t xml:space="preserve"> doesn't remain applicable.</w:t>
       </w:r>
     </w:p>
     <w:p>
@@ -959,10 +1163,34 @@
         <w:jc w:val="both"/>
       </w:pPr>
       <w:r>
-        <w:t>One thing early DevSecOps research kept bringing up was that security was getting pushed to the side inside DevOps pipelines. It was not being ignored completely, but it was clearly not being treated as a priority either. Nikolov and Aleksieva-Petrova (2023) wanted to look at this more closely and chose Jenkins as their environment. They put Snyk and OWASP ZAP into the pipeline at various points. The idea was to check which stages were actually picking up security issues and which ones were missing them. Finding vulnerabilities before deployment was shown to be possible, which was a useful outcome. That said, container security was not part of what they looked at, and nothing was set up to monitor the system after it went live</w:t>
-      </w:r>
-      <w:r>
-        <w:t>[1]</w:t>
+        <w:t xml:space="preserve">One thing early </w:t>
+      </w:r>
+      <w:proofErr w:type="spellStart"/>
+      <w:r>
+        <w:t>DevSecOps</w:t>
+      </w:r>
+      <w:proofErr w:type="spellEnd"/>
+      <w:r>
+        <w:t xml:space="preserve"> research kept bringing up was that security was getting pushed to the side inside DevOps pipelines. It was not being ignored completely, but it was clearly not being treated as a priority either. Nikolov and Aleksieva-Petrova (2023) wanted to look at this more closely and chose Jenkins as their environment. They put </w:t>
+      </w:r>
+      <w:proofErr w:type="spellStart"/>
+      <w:r>
+        <w:t>Snyk</w:t>
+      </w:r>
+      <w:proofErr w:type="spellEnd"/>
+      <w:r>
+        <w:t xml:space="preserve"> and OWASP ZAP into the pipeline at various points. The idea was to check which stages were actually picking up security issues and which ones were missing them. Finding vulnerabilities before deployment was shown to be possible, which was a useful outcome. That said, container security was not part of what they looked at, and nothing was set up to monitor the system after it went </w:t>
+      </w:r>
+      <w:proofErr w:type="gramStart"/>
+      <w:r>
+        <w:t>live</w:t>
+      </w:r>
+      <w:r>
+        <w:t>[</w:t>
+      </w:r>
+      <w:proofErr w:type="gramEnd"/>
+      <w:r>
+        <w:t>1]</w:t>
       </w:r>
       <w:r>
         <w:t>.</w:t>
@@ -983,10 +1211,52 @@
         <w:t xml:space="preserve">  </w:t>
       </w:r>
       <w:r>
-        <w:t>Marandi et al. (2023) took a different approach entirely. Rather than Jenkins they used GitHub Actions as the base for their pipeline. Snyk and StackHawk were the tools they worked with, and Docker was running alongside everything. They did not stop at just scanning either — dashboards were added and parts of the remediation process were automated, so when issues came up the team had less manual work to get through. Even with those additions though, scanning container images and watching the runtime environment were still not covered</w:t>
-      </w:r>
-      <w:r>
-        <w:t>[4]</w:t>
+        <w:t xml:space="preserve">Marandi et al. (2023) took a different approach entirely. Rather than Jenkins they used GitHub Actions as the base for their pipeline. </w:t>
+      </w:r>
+      <w:proofErr w:type="spellStart"/>
+      <w:r>
+        <w:t>Snyk</w:t>
+      </w:r>
+      <w:proofErr w:type="spellEnd"/>
+      <w:r>
+        <w:t xml:space="preserve"> and </w:t>
+      </w:r>
+      <w:proofErr w:type="spellStart"/>
+      <w:r>
+        <w:t>StackHawk</w:t>
+      </w:r>
+      <w:proofErr w:type="spellEnd"/>
+      <w:r>
+        <w:t xml:space="preserve"> were the tools they worked with, and Docker was running alongside everything. They did not stop at just scanning either — dashboards were added and parts of the remediation process were automated, so when issues came up the team had less manual work to get through. Even with those additions though, scanning container images and watching the runtime environment were still not </w:t>
+      </w:r>
+      <w:proofErr w:type="gramStart"/>
+      <w:r>
+        <w:t>covered</w:t>
+      </w:r>
+      <w:r>
+        <w:t>[</w:t>
+      </w:r>
+      <w:proofErr w:type="gramEnd"/>
+      <w:r>
+        <w:t>4]</w:t>
+      </w:r>
+      <w:r>
+        <w:t>.</w:t>
+      </w:r>
+      <w:r>
+        <w:t xml:space="preserve"> </w:t>
+      </w:r>
+      <w:r>
+        <w:t>Dinh et al.</w:t>
+      </w:r>
+      <w:r>
+        <w:t xml:space="preserve"> </w:t>
+      </w:r>
+      <w:r>
+        <w:t>(2025)</w:t>
+      </w:r>
+      <w:r>
+        <w:t xml:space="preserve"> proposed Secure DevOps to improve smart contract security through automated vulnerability detection, but their work was limited to blockchain applications [9]</w:t>
       </w:r>
       <w:r>
         <w:t>.</w:t>
@@ -1007,7 +1277,23 @@
         <w:t xml:space="preserve"> </w:t>
       </w:r>
       <w:r>
-        <w:t xml:space="preserve">Around this same period some researchers started looking beyond the technical side of things. Nayanajith and Wickramarachchi (2024) found that the biggest obstacles teams were hitting during DevSecOps adoption were not really about which tools to pick or how to configure them. Skill gaps were a common issue, and so was </w:t>
+        <w:t xml:space="preserve">Around this same period some researchers started looking beyond the technical side of things. </w:t>
+      </w:r>
+      <w:proofErr w:type="spellStart"/>
+      <w:r>
+        <w:t>Nayanajith</w:t>
+      </w:r>
+      <w:proofErr w:type="spellEnd"/>
+      <w:r>
+        <w:t xml:space="preserve"> and Wickramarachchi (2024) found that the biggest obstacles teams were hitting during </w:t>
+      </w:r>
+      <w:proofErr w:type="spellStart"/>
+      <w:r>
+        <w:t>DevSecOps</w:t>
+      </w:r>
+      <w:proofErr w:type="spellEnd"/>
+      <w:r>
+        <w:t xml:space="preserve"> adoption were not really about which tools to pick or how to configure them. Skill gaps were a common issue, and so was </w:t>
       </w:r>
       <w:r>
         <w:t>pushback came from engineers who</w:t>
@@ -1023,6 +1309,9 @@
       </w:r>
       <w:r>
         <w:t>. On top of that, different groups within the same organisation were often not communicating well with each other. Fixing the technical setup was the easier part of the problem — shifting how people actually worked and collaborated on a daily basis was where things got genuinely difficult</w:t>
+      </w:r>
+      <w:r>
+        <w:t xml:space="preserve"> </w:t>
       </w:r>
       <w:r>
         <w:t>[7]</w:t>
@@ -1076,11 +1365,16 @@
         <w:t xml:space="preserve"> </w:t>
       </w:r>
       <w:r>
-        <w:t>outside of controlled settings. That is a real limitation because it leaves open the question of how any of it would hold up in a live environment where conditions are messier and less predictable</w:t>
+        <w:t xml:space="preserve">outside of controlled settings. That is a real limitation because it leaves open the question of how any of it would hold up in a live environment where conditions are messier and less </w:t>
+      </w:r>
+      <w:proofErr w:type="gramStart"/>
+      <w:r>
+        <w:t>predictable</w:t>
       </w:r>
       <w:r>
         <w:t>[</w:t>
       </w:r>
+      <w:proofErr w:type="gramEnd"/>
       <w:r>
         <w:t>11</w:t>
       </w:r>
@@ -1118,8 +1412,13 @@
         <w:t xml:space="preserve">pipeline and adding Prometheus and Grafana on top. Security was still part of the focus but so was overall system performance. Having Prometheus collecting data and Grafana displaying it meant teams </w:t>
       </w:r>
       <w:r>
-        <w:t>gained genuine visibility into system behavior</w:t>
-      </w:r>
+        <w:t xml:space="preserve">gained genuine visibility into system </w:t>
+      </w:r>
+      <w:proofErr w:type="spellStart"/>
+      <w:r>
+        <w:t>behavior</w:t>
+      </w:r>
+      <w:proofErr w:type="spellEnd"/>
       <w:r>
         <w:t xml:space="preserve"> with their systems after deployment rather than </w:t>
       </w:r>
@@ -1139,7 +1438,15 @@
         <w:t xml:space="preserve"> </w:t>
       </w:r>
       <w:r>
-        <w:t xml:space="preserve">noted that Trivy </w:t>
+        <w:t xml:space="preserve">noted that </w:t>
+      </w:r>
+      <w:proofErr w:type="spellStart"/>
+      <w:r>
+        <w:t>Trivy</w:t>
+      </w:r>
+      <w:proofErr w:type="spellEnd"/>
+      <w:r>
+        <w:t xml:space="preserve"> </w:t>
       </w:r>
       <w:r>
         <w:t>helps to check</w:t>
@@ -1148,25 +1455,7 @@
         <w:t xml:space="preserve"> container-related issues</w:t>
       </w:r>
       <w:r>
-        <w:t>[</w:t>
-      </w:r>
-      <w:r>
-        <w:t>2</w:t>
-      </w:r>
-      <w:r>
-        <w:t>][</w:t>
-      </w:r>
-      <w:r>
-        <w:t>3</w:t>
-      </w:r>
-      <w:r>
-        <w:t>][</w:t>
-      </w:r>
-      <w:r>
-        <w:t>10</w:t>
-      </w:r>
-      <w:r>
-        <w:t>]</w:t>
+        <w:t xml:space="preserve"> [2][3][5][6][10]</w:t>
       </w:r>
       <w:r>
         <w:t>.</w:t>
@@ -1178,88 +1467,56 @@
         <w:jc w:val="both"/>
       </w:pPr>
       <w:r>
-        <w:t xml:space="preserve">    </w:t>
-      </w:r>
-      <w:r>
-        <w:t xml:space="preserve">  </w:t>
+        <w:t xml:space="preserve">Some </w:t>
+      </w:r>
+      <w:proofErr w:type="spellStart"/>
+      <w:r>
+        <w:t>DevSecOps</w:t>
+      </w:r>
+      <w:proofErr w:type="spellEnd"/>
+      <w:r>
+        <w:t xml:space="preserve"> studies</w:t>
       </w:r>
       <w:r>
         <w:t xml:space="preserve"> </w:t>
       </w:r>
       <w:r>
-        <w:t xml:space="preserve">In DevSecOps, some studies follow the CAMS model. </w:t>
-      </w:r>
-      <w:r>
-        <w:t>This mainly includes culture, automation, measurement and sharing.</w:t>
-      </w:r>
-      <w:r>
-        <w:t>.</w:t>
-      </w:r>
+        <w:t xml:space="preserve">apply the CAMS model to address key factors, Culture, Automation, Measurement, and Sharing. These elements were identified as the primary aspects related to the successful implementation of </w:t>
+      </w:r>
+      <w:proofErr w:type="spellStart"/>
+      <w:r>
+        <w:t>DevSecOps</w:t>
+      </w:r>
+      <w:proofErr w:type="spellEnd"/>
+      <w:r>
+        <w:t xml:space="preserve">. The studies reported that these characteristics significantly </w:t>
+      </w:r>
+      <w:proofErr w:type="gramStart"/>
+      <w:r>
+        <w:t>improve  the</w:t>
+      </w:r>
+      <w:proofErr w:type="gramEnd"/>
+      <w:r>
+        <w:t xml:space="preserve"> adoption of </w:t>
+      </w:r>
+      <w:proofErr w:type="spellStart"/>
+      <w:r>
+        <w:t>DevSecOps</w:t>
+      </w:r>
+      <w:proofErr w:type="spellEnd"/>
       <w:r>
         <w:t xml:space="preserve"> </w:t>
       </w:r>
-      <w:r>
-        <w:t>These factors are seen as important</w:t>
-      </w:r>
-      <w:r>
-        <w:t xml:space="preserve"> when applying DevSecOps in real situations </w:t>
-      </w:r>
-      <w:r>
-        <w:t>These aspects are seen as useful</w:t>
-      </w:r>
-      <w:r>
-        <w:t xml:space="preserve"> when trying to </w:t>
-      </w:r>
-      <w:r>
-        <w:t>use DevSecOps in</w:t>
-      </w:r>
-      <w:r>
-        <w:t xml:space="preserve"> practical situations. </w:t>
-      </w:r>
-      <w:r>
-        <w:t>These factors matter when</w:t>
-      </w:r>
-      <w:r>
-        <w:t xml:space="preserve"> </w:t>
-      </w:r>
-      <w:r>
-        <w:t xml:space="preserve">applying DevSecOps in real environments. It </w:t>
-      </w:r>
-      <w:r>
-        <w:t xml:space="preserve">demonstrated a measurable effect on </w:t>
-      </w:r>
-      <w:r>
-        <w:t>an effect on</w:t>
-      </w:r>
-      <w:r>
-        <w:t xml:space="preserve"> </w:t>
-      </w:r>
-      <w:r>
-        <w:t xml:space="preserve"> a strong effect on</w:t>
-      </w:r>
-      <w:r>
-        <w:t xml:space="preserve"> successfully applying DevSecOps in real environments</w:t>
+      <w:proofErr w:type="gramStart"/>
+      <w:r>
+        <w:t>practices</w:t>
       </w:r>
       <w:r>
         <w:t>[</w:t>
       </w:r>
-      <w:r>
-        <w:t>8</w:t>
-      </w:r>
-      <w:r>
-        <w:t>][</w:t>
-      </w:r>
-      <w:r>
-        <w:t>13</w:t>
-      </w:r>
-      <w:r>
-        <w:t>][</w:t>
-      </w:r>
-      <w:r>
-        <w:t>14</w:t>
-      </w:r>
-      <w:r>
-        <w:t>]</w:t>
+      <w:proofErr w:type="gramEnd"/>
+      <w:r>
+        <w:t>8][12][13][14]</w:t>
       </w:r>
       <w:r>
         <w:t>.</w:t>
@@ -1313,7 +1570,15 @@
         <w:t xml:space="preserve">  </w:t>
       </w:r>
       <w:r>
-        <w:t>From these studies, it is observed that DevSecOps is improving, but some gaps still remain. From these studies, it appears that many works focus only on specific parts such as scanning or monitoring, but do not cover the complete pipeline.</w:t>
+        <w:t xml:space="preserve">From these studies, it is observed that </w:t>
+      </w:r>
+      <w:proofErr w:type="spellStart"/>
+      <w:r>
+        <w:t>DevSecOps</w:t>
+      </w:r>
+      <w:proofErr w:type="spellEnd"/>
+      <w:r>
+        <w:t xml:space="preserve"> is improving, but some gaps still remain. From these studies, it appears that many works focus only on specific parts such as scanning or monitoring, but do not cover the complete pipeline.</w:t>
       </w:r>
     </w:p>
     <w:p>
@@ -1328,7 +1593,15 @@
         <w:t xml:space="preserve">       </w:t>
       </w:r>
       <w:r>
-        <w:t>Looking across these studies, a pattern becomes clear — most of them tackle one or two pieces of the pipeline rather than treating it as a whole. This work takes a different angle by connecting those pieces into something more complete. Static testing, dynamic testing, container scanning through Trivy, and continuous monitoring via Prometheus and Grafana are all brought into a single pipeline rather than handled separately</w:t>
+        <w:t xml:space="preserve">Looking across these studies, a pattern becomes clear — most of them tackle one or two pieces of the pipeline rather than treating it as a whole. This work takes a different angle by connecting those pieces into something more complete. Static testing, dynamic testing, container scanning through </w:t>
+      </w:r>
+      <w:proofErr w:type="spellStart"/>
+      <w:r>
+        <w:t>Trivy</w:t>
+      </w:r>
+      <w:proofErr w:type="spellEnd"/>
+      <w:r>
+        <w:t>, and continuous monitoring via Prometheus and Grafana are all brought into a single pipeline rather than handled separately</w:t>
       </w:r>
       <w:r>
         <w:t>.</w:t>
@@ -1352,10 +1625,21 @@
         <w:t>.</w:t>
       </w:r>
       <w:r>
-        <w:rPr>
-          <w:lang w:val="en-IN"/>
-        </w:rPr>
-        <w:t>This work tries to piece these things together in a way that security can be checked at every step along the way</w:t>
+        <w:t xml:space="preserve"> </w:t>
+      </w:r>
+      <w:proofErr w:type="gramStart"/>
+      <w:r>
+        <w:rPr>
+          <w:lang w:val="en-IN"/>
+        </w:rPr>
+        <w:t>This</w:t>
+      </w:r>
+      <w:proofErr w:type="gramEnd"/>
+      <w:r>
+        <w:rPr>
+          <w:lang w:val="en-IN"/>
+        </w:rPr>
+        <w:t xml:space="preserve"> work tries to piece these things together in a way that security can be checked at every step along the way</w:t>
       </w:r>
       <w:r>
         <w:t>.</w:t>
@@ -1391,8 +1675,16 @@
         <w:rPr>
           <w:lang w:val="en-IN"/>
         </w:rPr>
-        <w:t>This system integrates security in DevSecOps</w:t>
-      </w:r>
+        <w:t xml:space="preserve">This system integrates security in </w:t>
+      </w:r>
+      <w:proofErr w:type="spellStart"/>
+      <w:r>
+        <w:rPr>
+          <w:lang w:val="en-IN"/>
+        </w:rPr>
+        <w:t>DevSecOps</w:t>
+      </w:r>
+      <w:proofErr w:type="spellEnd"/>
       <w:r>
         <w:rPr>
           <w:lang w:val="en-IN"/>
@@ -1415,8 +1707,16 @@
         <w:rPr>
           <w:lang w:val="en-IN"/>
         </w:rPr>
-        <w:t>for CI/CD The idea of implementing a secure DevSecOps</w:t>
-      </w:r>
+        <w:t xml:space="preserve">for CI/CD The idea of implementing a secure </w:t>
+      </w:r>
+      <w:proofErr w:type="spellStart"/>
+      <w:r>
+        <w:rPr>
+          <w:lang w:val="en-IN"/>
+        </w:rPr>
+        <w:t>DevSecOps</w:t>
+      </w:r>
+      <w:proofErr w:type="spellEnd"/>
       <w:r>
         <w:rPr>
           <w:lang w:val="en-IN"/>
@@ -1439,8 +1739,16 @@
         <w:rPr>
           <w:lang w:val="en-IN"/>
         </w:rPr>
-        <w:t>pipeline in the software industry performs security checks only at the end phase, unlike this DevSecOps</w:t>
-      </w:r>
+        <w:t xml:space="preserve">pipeline in the software industry performs security checks only at the end phase, unlike this </w:t>
+      </w:r>
+      <w:proofErr w:type="spellStart"/>
+      <w:r>
+        <w:rPr>
+          <w:lang w:val="en-IN"/>
+        </w:rPr>
+        <w:t>DevSecOps</w:t>
+      </w:r>
+      <w:proofErr w:type="spellEnd"/>
       <w:r>
         <w:rPr>
           <w:lang w:val="en-IN"/>
@@ -1563,7 +1871,17 @@
           <w:sz w:val="16"/>
           <w:szCs w:val="16"/>
         </w:rPr>
-        <w:t>. DevSecOps</w:t>
+        <w:t xml:space="preserve">. </w:t>
+      </w:r>
+      <w:r>
+        <w:rPr>
+          <w:rFonts w:eastAsia="MS Mincho"/>
+          <w:i w:val="0"/>
+          <w:sz w:val="16"/>
+          <w:szCs w:val="16"/>
+          <w:lang w:val="en-GB"/>
+        </w:rPr>
+        <w:t>Proposed DevSecOps Pipeline</w:t>
       </w:r>
     </w:p>
     <w:p>
@@ -1596,7 +1914,19 @@
         <w:rPr>
           <w:lang w:val="en-IN"/>
         </w:rPr>
-        <w:t xml:space="preserve"> represents a Jenkins pipeline workflow that starts when a developer commit code in a Git repository. Code commit initiates Jenkins pipeline for the entire workflow, which then calls SonarQube for</w:t>
+        <w:t xml:space="preserve"> represents a Jenkins pipeline workflow that starts when a developer commit</w:t>
+      </w:r>
+      <w:r>
+        <w:rPr>
+          <w:lang w:val="en-IN"/>
+        </w:rPr>
+        <w:t>s</w:t>
+      </w:r>
+      <w:r>
+        <w:rPr>
+          <w:lang w:val="en-IN"/>
+        </w:rPr>
+        <w:t xml:space="preserve"> code in a Git repository. Code commit initiates Jenkins pipeline for the entire workflow, which then calls SonarQube for</w:t>
       </w:r>
       <w:r>
         <w:rPr>
@@ -1616,11 +1946,47 @@
         </w:rPr>
         <w:t xml:space="preserve"> </w:t>
       </w:r>
-      <w:r>
-        <w:rPr>
-          <w:lang w:val="en-IN"/>
-        </w:rPr>
-        <w:t>Testing(SAST)to identify bug, code quality issues and security vulnerability in source code, If the code satisfy the defined quality gate then the application will compile and packaging then a docker image is build.</w:t>
+      <w:proofErr w:type="gramStart"/>
+      <w:r>
+        <w:rPr>
+          <w:lang w:val="en-IN"/>
+        </w:rPr>
+        <w:t>Testing(</w:t>
+      </w:r>
+      <w:proofErr w:type="gramEnd"/>
+      <w:r>
+        <w:rPr>
+          <w:lang w:val="en-IN"/>
+        </w:rPr>
+        <w:t xml:space="preserve">SAST)to identify bug, code quality issues and security vulnerability in source code, If the code </w:t>
+      </w:r>
+      <w:proofErr w:type="gramStart"/>
+      <w:r>
+        <w:rPr>
+          <w:lang w:val="en-IN"/>
+        </w:rPr>
+        <w:t>satisfy</w:t>
+      </w:r>
+      <w:proofErr w:type="gramEnd"/>
+      <w:r>
+        <w:rPr>
+          <w:lang w:val="en-IN"/>
+        </w:rPr>
+        <w:t xml:space="preserve"> the defined quality </w:t>
+      </w:r>
+      <w:proofErr w:type="gramStart"/>
+      <w:r>
+        <w:rPr>
+          <w:lang w:val="en-IN"/>
+        </w:rPr>
+        <w:t>gate</w:t>
+      </w:r>
+      <w:proofErr w:type="gramEnd"/>
+      <w:r>
+        <w:rPr>
+          <w:lang w:val="en-IN"/>
+        </w:rPr>
+        <w:t xml:space="preserve"> then the application will compile and packaging then a docker image is build.</w:t>
       </w:r>
     </w:p>
     <w:p>
@@ -1632,7 +1998,21 @@
         <w:t xml:space="preserve">       </w:t>
       </w:r>
       <w:r>
-        <w:t>Once the container image is built, it’s security tested with Trivy for any vulnerabilities, unsafe packages, or configuration files. If the container passes this security test, then it’s deployed to the Kubernetes cluster. Dynamic Application Security Testing is performed by OWASP ZAP by checking the deployed application for OWASP-recognized vulnerability type like SQL injection, Cross-site Scripting (XSS), insecure configurations and more.</w:t>
+        <w:t>Once the container image is built, it</w:t>
+      </w:r>
+      <w:r>
+        <w:t xml:space="preserve"> is</w:t>
+      </w:r>
+      <w:r>
+        <w:t xml:space="preserve"> security tested with </w:t>
+      </w:r>
+      <w:proofErr w:type="spellStart"/>
+      <w:r>
+        <w:t>Trivy</w:t>
+      </w:r>
+      <w:proofErr w:type="spellEnd"/>
+      <w:r>
+        <w:t xml:space="preserve"> for any vulnerabilities, unsafe packages, or configuration files. If the container passes this security test, then it’s deployed to the Kubernetes cluster. Dynamic Application Security Testing is performed by OWASP ZAP by checking the deployed application for OWASP-recognized vulnerability type like SQL injection, Cross-site Scripting (XSS), insecure configurations and more.</w:t>
       </w:r>
     </w:p>
     <w:p>
@@ -1674,7 +2054,15 @@
         <w:jc w:val="both"/>
       </w:pPr>
       <w:r>
-        <w:t>The suggested DevSecOps system</w:t>
+        <w:t xml:space="preserve">The suggested </w:t>
+      </w:r>
+      <w:proofErr w:type="spellStart"/>
+      <w:r>
+        <w:t>DevSecOps</w:t>
+      </w:r>
+      <w:proofErr w:type="spellEnd"/>
+      <w:r>
+        <w:t xml:space="preserve"> system</w:t>
       </w:r>
       <w:r>
         <w:t xml:space="preserve"> </w:t>
@@ -1686,7 +2074,15 @@
         <w:t xml:space="preserve"> </w:t>
       </w:r>
       <w:r>
-        <w:t>and continuous monitoring to ensure delivery of secure code. DevSecOps uses step-by-step automation flow which completes certain tasks for SDLC while running the code</w:t>
+        <w:t xml:space="preserve">and continuous monitoring to ensure delivery of secure code. </w:t>
+      </w:r>
+      <w:proofErr w:type="spellStart"/>
+      <w:r>
+        <w:t>DevSecOps</w:t>
+      </w:r>
+      <w:proofErr w:type="spellEnd"/>
+      <w:r>
+        <w:t xml:space="preserve"> uses step-by-step automation flow which completes certain tasks for SDLC while running the code</w:t>
       </w:r>
       <w:r>
         <w:t>.</w:t>
@@ -1773,7 +2169,15 @@
         <w:t xml:space="preserve">. </w:t>
       </w:r>
       <w:r>
-        <w:t>Before releasing (deployment) Trivy does an image scanning for known vulnerabilities in dependencies. If it finds the risks or vulnerability found in the updated dependency the pipeline will hold at that position. Hence no vulnerability or risks found in the dependency reach to Production Environment</w:t>
+        <w:t xml:space="preserve">Before releasing (deployment) </w:t>
+      </w:r>
+      <w:proofErr w:type="spellStart"/>
+      <w:r>
+        <w:t>Trivy</w:t>
+      </w:r>
+      <w:proofErr w:type="spellEnd"/>
+      <w:r>
+        <w:t xml:space="preserve"> does an image scanning for known vulnerabilities in dependencies. If it finds the risks or vulnerability found in the updated dependency the pipeline will hold at that position. Hence no vulnerability or risks found in the dependency reach to Production Environment</w:t>
       </w:r>
       <w:r>
         <w:t>.</w:t>
@@ -1824,7 +2228,15 @@
         <w:t xml:space="preserve">       </w:t>
       </w:r>
       <w:r>
-        <w:t>Table I provides a summary of the tools used in the DevSecOps pipeline proposed. Through early detection of security threats, minimization of human work and a stable deployment cycle, the proposed technique achieves higher levels of software reliability, automation and security in the entire software lifecycle.</w:t>
+        <w:t xml:space="preserve">Table I provides a summary of the tools used in the </w:t>
+      </w:r>
+      <w:proofErr w:type="spellStart"/>
+      <w:r>
+        <w:t>DevSecOps</w:t>
+      </w:r>
+      <w:proofErr w:type="spellEnd"/>
+      <w:r>
+        <w:t xml:space="preserve"> pipeline proposed. Through early detection of security threats, minimization of human work and a stable deployment cycle, the proposed technique achieves higher levels of software reliability, automation and security in the entire software lifecycle.</w:t>
       </w:r>
     </w:p>
     <w:p>
@@ -1853,7 +2265,31 @@
           <w:szCs w:val="16"/>
           <w:lang w:eastAsia="x-none"/>
         </w:rPr>
-        <w:t>Table I: Tools Used in DevSecOps Pipeline</w:t>
+        <w:t xml:space="preserve">Table I: Tools Used in </w:t>
+      </w:r>
+      <w:proofErr w:type="spellStart"/>
+      <w:r>
+        <w:rPr>
+          <w:bCs/>
+          <w:color w:val="000000" w:themeColor="text1"/>
+          <w:spacing w:val="-1"/>
+          <w:sz w:val="16"/>
+          <w:szCs w:val="16"/>
+          <w:lang w:eastAsia="x-none"/>
+        </w:rPr>
+        <w:t>DevSecOps</w:t>
+      </w:r>
+      <w:proofErr w:type="spellEnd"/>
+      <w:r>
+        <w:rPr>
+          <w:bCs/>
+          <w:color w:val="000000" w:themeColor="text1"/>
+          <w:spacing w:val="-1"/>
+          <w:sz w:val="16"/>
+          <w:szCs w:val="16"/>
+          <w:lang w:eastAsia="x-none"/>
+        </w:rPr>
+        <w:t xml:space="preserve"> Pipeline</w:t>
       </w:r>
     </w:p>
     <w:tbl>
@@ -2508,12 +2944,14 @@
                 <w:lang w:val="en-IN"/>
               </w:rPr>
             </w:pPr>
+            <w:proofErr w:type="spellStart"/>
             <w:r>
               <w:rPr>
                 <w:lang w:val="en-IN"/>
               </w:rPr>
               <w:t>Trivy</w:t>
             </w:r>
+            <w:proofErr w:type="spellEnd"/>
           </w:p>
         </w:tc>
         <w:tc>
@@ -3045,7 +3483,23 @@
         <w:jc w:val="both"/>
       </w:pPr>
       <w:r>
-        <w:t>The DevSecOps pipeline concept that was designed, was developed and tested with Git, Jenkins, SonarQube, Docker, Trivy, Kubernetes, OWASP ZAP, Prometheus, and Grafana. The running of the pipe line confirmed security testing had been incorporated at every step of the CI / CD process and the delivery of software remained automated.</w:t>
+        <w:t xml:space="preserve">The </w:t>
+      </w:r>
+      <w:proofErr w:type="spellStart"/>
+      <w:r>
+        <w:t>DevSecOps</w:t>
+      </w:r>
+      <w:proofErr w:type="spellEnd"/>
+      <w:r>
+        <w:t xml:space="preserve"> pipeline concept that was designed, was developed and tested with Git, Jenkins, SonarQube, Docker, </w:t>
+      </w:r>
+      <w:proofErr w:type="spellStart"/>
+      <w:r>
+        <w:t>Trivy</w:t>
+      </w:r>
+      <w:proofErr w:type="spellEnd"/>
+      <w:r>
+        <w:t>, Kubernetes, OWASP ZAP, Prometheus, and Grafana. The running of the pipeline confirmed security testing had been incorporated at every step of the CI / CD process and the delivery of software remained automated.</w:t>
       </w:r>
     </w:p>
     <w:p>
@@ -3184,7 +3638,21 @@
         <w:t>.</w:t>
       </w:r>
       <w:r>
-        <w:t xml:space="preserve"> 3 indicates that Jenkins had performed all phases of the CI/CD pipeline, source code check out, installing dependency, application build, static code analysis, testing and Quality Gate validation, that meant all the phases completed successfully. From which, we can come to conclusion that the pipeline developed has been used to automate the software delivery, without human involvement and that security measures had been checked at all phases of the Software Development lifecycle.</w:t>
+        <w:t xml:space="preserve"> 3 indicates that Jenkins had performed all phases of the CI/CD pipeline, source code </w:t>
+      </w:r>
+      <w:proofErr w:type="gramStart"/>
+      <w:r>
+        <w:t>check</w:t>
+      </w:r>
+      <w:proofErr w:type="gramEnd"/>
+      <w:r>
+        <w:t xml:space="preserve"> out, installing dependency, application build, static code analysis, testing and Quality Gate validation, that meant all the phases completed successfully. </w:t>
+      </w:r>
+      <w:r>
+        <w:t xml:space="preserve">From this, it can be concluded </w:t>
+      </w:r>
+      <w:r>
+        <w:t>that the pipeline developed has been used to automate the software delivery, without human involvement and that security measures had been checked at all phases of the Software Development lifecycle.</w:t>
       </w:r>
     </w:p>
     <w:tbl>
@@ -3223,7 +3691,7 @@
                 <w:noProof/>
               </w:rPr>
               <w:drawing>
-                <wp:inline distT="0" distB="0" distL="0" distR="0" wp14:anchorId="151A6A3D" wp14:editId="797A70FC">
+                <wp:inline distT="0" distB="0" distL="0" distR="0" wp14:anchorId="151A6A3D" wp14:editId="2EB8BD3C">
                   <wp:extent cx="2659601" cy="2009002"/>
                   <wp:effectExtent l="19050" t="19050" r="7620" b="0"/>
                   <wp:docPr id="1676718502" name="Picture 8"/>
@@ -3451,8 +3919,17 @@
                 <w:sz w:val="16"/>
                 <w:szCs w:val="16"/>
               </w:rPr>
-              <w:t xml:space="preserve">. </w:t>
-            </w:r>
+              <w:t>.</w:t>
+            </w:r>
+            <w:r>
+              <w:rPr>
+                <w:rFonts w:eastAsia="MS Mincho"/>
+                <w:sz w:val="16"/>
+                <w:szCs w:val="16"/>
+              </w:rPr>
+              <w:t xml:space="preserve"> </w:t>
+            </w:r>
+            <w:proofErr w:type="spellStart"/>
             <w:r>
               <w:rPr>
                 <w:rFonts w:eastAsia="MS Mincho"/>
@@ -3460,7 +3937,17 @@
                 <w:szCs w:val="16"/>
                 <w:lang w:val="en-GB"/>
               </w:rPr>
-              <w:t>Trivy Security Report</w:t>
+              <w:t>Trivy</w:t>
+            </w:r>
+            <w:proofErr w:type="spellEnd"/>
+            <w:r>
+              <w:rPr>
+                <w:rFonts w:eastAsia="MS Mincho"/>
+                <w:sz w:val="16"/>
+                <w:szCs w:val="16"/>
+                <w:lang w:val="en-GB"/>
+              </w:rPr>
+              <w:t xml:space="preserve"> Security Report</w:t>
             </w:r>
           </w:p>
         </w:tc>
@@ -3499,7 +3986,35 @@
         <w:rPr>
           <w:lang w:val="en-IN"/>
         </w:rPr>
-        <w:t xml:space="preserve"> 5 shows the security verification result of the container image via Trivy. In the figure, Trivy has found vulnerability with different degrees in the container image, which allows developers to notice some of the old packages and the security holes in the container image prior to it is delivered to production environment. Having the container image scanning embedded in the CI/CD process may reduce the chances of delivering potentially unsafe software to production.</w:t>
+        <w:t xml:space="preserve"> 5 shows the security verification result of the container image via </w:t>
+      </w:r>
+      <w:proofErr w:type="spellStart"/>
+      <w:r>
+        <w:rPr>
+          <w:lang w:val="en-IN"/>
+        </w:rPr>
+        <w:t>Trivy</w:t>
+      </w:r>
+      <w:proofErr w:type="spellEnd"/>
+      <w:r>
+        <w:rPr>
+          <w:lang w:val="en-IN"/>
+        </w:rPr>
+        <w:t xml:space="preserve">. In the figure, </w:t>
+      </w:r>
+      <w:proofErr w:type="spellStart"/>
+      <w:r>
+        <w:rPr>
+          <w:lang w:val="en-IN"/>
+        </w:rPr>
+        <w:t>Trivy</w:t>
+      </w:r>
+      <w:proofErr w:type="spellEnd"/>
+      <w:r>
+        <w:rPr>
+          <w:lang w:val="en-IN"/>
+        </w:rPr>
+        <w:t xml:space="preserve"> has found vulnerability with different degrees in the container image, which allows developers to notice some of the old packages and the security holes in the container image prior to it is delivered to production environment. Having the container image scanning embedded in the CI/CD process may reduce the chances of delivering potentially unsafe software to production.</w:t>
       </w:r>
     </w:p>
     <w:p>
@@ -3534,7 +4049,15 @@
         <w:t>.</w:t>
       </w:r>
       <w:r>
-        <w:t xml:space="preserve"> 7 Prometheus sampled metrics related to runtime (e.g. Total http requests, request per second, latency of response and number of server errors) and the same metrics were displayed by Grafana through customizable dashboards. The system enabled continuous observability of application behavior and allowed the quick detection of abnormalities of the running system.</w:t>
+        <w:t xml:space="preserve"> 7 Prometheus sampled metrics related to runtime (e.g. Total http requests, request per second, latency of response and number of server errors) and the same metrics were displayed by Grafana through customizable dashboards. The system enabled continuous observability of application </w:t>
+      </w:r>
+      <w:proofErr w:type="spellStart"/>
+      <w:r>
+        <w:t>behavior</w:t>
+      </w:r>
+      <w:proofErr w:type="spellEnd"/>
+      <w:r>
+        <w:t xml:space="preserve"> and allowed the quick detection of abnormalities of the running system.</w:t>
       </w:r>
     </w:p>
     <w:tbl>
@@ -3574,7 +4097,7 @@
                 <w:lang w:val="en-IN"/>
               </w:rPr>
               <w:drawing>
-                <wp:inline distT="0" distB="0" distL="0" distR="0" wp14:anchorId="5EF45EFC" wp14:editId="2D2B842D">
+                <wp:inline distT="0" distB="0" distL="0" distR="0" wp14:anchorId="5EF45EFC" wp14:editId="3576EEED">
                   <wp:extent cx="2780328" cy="1627505"/>
                   <wp:effectExtent l="19050" t="19050" r="0" b="5080"/>
                   <wp:docPr id="1260153653" name="Picture 10"/>
@@ -3827,7 +4350,15 @@
         <w:t xml:space="preserve">       </w:t>
       </w:r>
       <w:r>
-        <w:t>In summary, the implementation shows that a single DevSecOps pipeline that integrates static code analysis, container vulnerability scanning, dynamic application security testing, automated deployment, and continuous monitoring can significantly help detect vulnerabilities early, minimise manual security labour, improve deployment confidence and provide persistent operational insight during the software development life-cycle.</w:t>
+        <w:t xml:space="preserve">In summary, the implementation shows that a single </w:t>
+      </w:r>
+      <w:proofErr w:type="spellStart"/>
+      <w:r>
+        <w:t>DevSecOps</w:t>
+      </w:r>
+      <w:proofErr w:type="spellEnd"/>
+      <w:r>
+        <w:t xml:space="preserve"> pipeline that integrates static code analysis, container vulnerability scanning, dynamic application security testing, automated deployment, and continuous monitoring can significantly help detect vulnerabilities early, minimise manual security labour, improve deployment confidence and provide persistent operational insight during the software development life-cycle.</w:t>
       </w:r>
     </w:p>
     <w:p>
@@ -3878,7 +4409,20 @@
         <w:t xml:space="preserve">. </w:t>
       </w:r>
       <w:r>
-        <w:t>Traditionally, security was tacked on to the side of the process or a group of disparate, reactive patches to security problems. In this research, the pipeline, which addressed the three key phases of (code,container,post-deployment), is able to build in security into the pipeline logic at all of the points, and this impacts where we can discover and remediate issues.</w:t>
+        <w:t>Traditionally, security was tacked on to the side of the process or a group of disparate, reactive patches to security problems. In this research, the pipeline, which addressed the three key phases of (</w:t>
+      </w:r>
+      <w:proofErr w:type="spellStart"/>
+      <w:proofErr w:type="gramStart"/>
+      <w:r>
+        <w:t>code,container</w:t>
+      </w:r>
+      <w:proofErr w:type="gramEnd"/>
+      <w:r>
+        <w:t>,post</w:t>
+      </w:r>
+      <w:proofErr w:type="spellEnd"/>
+      <w:r>
+        <w:t>-deployment), is able to build in security into the pipeline logic at all of the points, and this impacts where we can discover and remediate issues.</w:t>
       </w:r>
     </w:p>
     <w:p>
@@ -4448,7 +4992,21 @@
               <w:rPr>
                 <w:lang w:val="en-IN"/>
               </w:rPr>
-              <w:t>End-to-End DevSecOps Pipeline</w:t>
+              <w:t xml:space="preserve">End-to-End </w:t>
+            </w:r>
+            <w:proofErr w:type="spellStart"/>
+            <w:r>
+              <w:rPr>
+                <w:lang w:val="en-IN"/>
+              </w:rPr>
+              <w:t>DevSecOps</w:t>
+            </w:r>
+            <w:proofErr w:type="spellEnd"/>
+            <w:r>
+              <w:rPr>
+                <w:lang w:val="en-IN"/>
+              </w:rPr>
+              <w:t xml:space="preserve"> Pipeline</w:t>
             </w:r>
           </w:p>
         </w:tc>
@@ -4501,21 +5059,6 @@
         <w:spacing w:before="100" w:beforeAutospacing="1" w:after="100" w:afterAutospacing="1"/>
         <w:jc w:val="both"/>
       </w:pPr>
-      <w:r>
-        <w:t>V</w:t>
-      </w:r>
-      <w:r>
-        <w:t>II</w:t>
-      </w:r>
-      <w:r>
-        <w:t>.</w:t>
-      </w:r>
-      <w:r>
-        <w:t xml:space="preserve"> </w:t>
-      </w:r>
-      <w:r>
-        <w:t>CONCLUSION</w:t>
-      </w:r>
     </w:p>
     <w:p>
       <w:pPr>
@@ -4523,7 +5066,19 @@
         <w:jc w:val="both"/>
       </w:pPr>
       <w:r>
-        <w:t>In this study, we proposed a secure DevSecOps framework which can incorporate security throughout the CI/CD pipeline stages. Our proposed secure DevSecOps framework integrates Git, Jenkins, SonarQube, Docker, Trivy, Kubernetes, OWASP ZAP, Prometheus and Grafana, thereby enabling to secure the software development pipeline and continuous validation on the application security throughout the CI/CD pipeline. It was validated through implementation, that it is feasible to find out security issues earlier, increase deployment reliability and decrease human security resources if static code analysis, container security vulnerability scanner, application vulnerability scanner, and continuous monitoring application is seamlessly connected in a workflow. The outcome of this study provides evidence that our proposed system has correctly executed the whole pipeline, and verified automatic validation on application security throughout SDLC pipeline successfully.</w:t>
+        <w:t>V</w:t>
+      </w:r>
+      <w:r>
+        <w:t>II</w:t>
+      </w:r>
+      <w:r>
+        <w:t>.</w:t>
+      </w:r>
+      <w:r>
+        <w:t xml:space="preserve"> </w:t>
+      </w:r>
+      <w:r>
+        <w:t>CONCLUSION</w:t>
       </w:r>
     </w:p>
     <w:p>
@@ -4532,10 +5087,60 @@
         <w:jc w:val="both"/>
       </w:pPr>
       <w:r>
+        <w:t xml:space="preserve">In this study, we proposed a secure </w:t>
+      </w:r>
+      <w:proofErr w:type="spellStart"/>
+      <w:r>
+        <w:t>DevSecOps</w:t>
+      </w:r>
+      <w:proofErr w:type="spellEnd"/>
+      <w:r>
+        <w:t xml:space="preserve"> framework which can incorporate security throughout the CI/CD pipeline stages. Our proposed secure </w:t>
+      </w:r>
+      <w:proofErr w:type="spellStart"/>
+      <w:r>
+        <w:t>DevSecOps</w:t>
+      </w:r>
+      <w:proofErr w:type="spellEnd"/>
+      <w:r>
+        <w:t xml:space="preserve"> framework integrates Git, Jenkins, SonarQube, Docker, </w:t>
+      </w:r>
+      <w:proofErr w:type="spellStart"/>
+      <w:r>
+        <w:t>Trivy</w:t>
+      </w:r>
+      <w:proofErr w:type="spellEnd"/>
+      <w:r>
+        <w:t>, Kubernetes, OWASP ZAP, Prometheus and Grafana</w:t>
+      </w:r>
+      <w:r>
+        <w:t xml:space="preserve"> </w:t>
+      </w:r>
+      <w:r>
+        <w:t>thereby securing the software development pipeline</w:t>
+      </w:r>
+      <w:r>
+        <w:t xml:space="preserve"> and continuous validation on the application security throughout the CI/CD pipeline. It was validated through implementation, that it is feasible to find out security issues earlier, increase deployment reliability and decrease human security resources if static code analysis, container security vulnerability scanner, application vulnerability scanner, and continuous monitoring application is seamlessly connected in a workflow. The outcome of this study provides evidence that our proposed system has correctly executed the whole pipeline, and verified automatic validation on application security throughout SDLC pipeline successfully.</w:t>
+      </w:r>
+    </w:p>
+    <w:p>
+      <w:pPr>
+        <w:spacing w:before="100" w:beforeAutospacing="1" w:after="100" w:afterAutospacing="1"/>
+        <w:jc w:val="both"/>
+      </w:pPr>
+      <w:r>
         <w:t xml:space="preserve">       </w:t>
       </w:r>
       <w:r>
-        <w:t>Future enhancements to the framework include the incorporation of policy-as-code, Infrastructure as Code (IaC) security scanning and AI driven vulnerability detection.</w:t>
+        <w:t>Future enhancements to the framework include the incorporation of policy-as-code, Infrastructure as Code (</w:t>
+      </w:r>
+      <w:proofErr w:type="spellStart"/>
+      <w:r>
+        <w:t>IaC</w:t>
+      </w:r>
+      <w:proofErr w:type="spellEnd"/>
+      <w:r>
+        <w:t>) security scanning and AI driven vulnerability detection.</w:t>
       </w:r>
     </w:p>
     <w:p>
@@ -4566,7 +5171,21 @@
         <w:rPr>
           <w:lang w:val="en-GB"/>
         </w:rPr>
-        <w:t xml:space="preserve">L. A. Nikolov and A. P. Aleksieva-Petrova, “Action Research on the DevSecOps Pipeline,” in </w:t>
+        <w:t xml:space="preserve">L. A. Nikolov and A. P. Aleksieva-Petrova, “Action Research on the </w:t>
+      </w:r>
+      <w:proofErr w:type="spellStart"/>
+      <w:r>
+        <w:rPr>
+          <w:lang w:val="en-GB"/>
+        </w:rPr>
+        <w:t>DevSecOps</w:t>
+      </w:r>
+      <w:proofErr w:type="spellEnd"/>
+      <w:r>
+        <w:rPr>
+          <w:lang w:val="en-GB"/>
+        </w:rPr>
+        <w:t xml:space="preserve"> Pipeline,” in </w:t>
       </w:r>
       <w:r>
         <w:rPr>
@@ -4598,7 +5217,35 @@
         <w:rPr>
           <w:lang w:val="en-GB"/>
         </w:rPr>
-        <w:t xml:space="preserve">M. A. Aljohani and S. S. Alqahtani, “A Unified Framework for Automating Software Security Analysis in DevSecOps,” in </w:t>
+        <w:t xml:space="preserve">M. A. </w:t>
+      </w:r>
+      <w:proofErr w:type="spellStart"/>
+      <w:r>
+        <w:rPr>
+          <w:lang w:val="en-GB"/>
+        </w:rPr>
+        <w:t>Aljohani</w:t>
+      </w:r>
+      <w:proofErr w:type="spellEnd"/>
+      <w:r>
+        <w:rPr>
+          <w:lang w:val="en-GB"/>
+        </w:rPr>
+        <w:t xml:space="preserve"> and S. S. Alqahtani, “A Unified Framework for Automating Software Security Analysis in </w:t>
+      </w:r>
+      <w:proofErr w:type="spellStart"/>
+      <w:r>
+        <w:rPr>
+          <w:lang w:val="en-GB"/>
+        </w:rPr>
+        <w:t>DevSecOps</w:t>
+      </w:r>
+      <w:proofErr w:type="spellEnd"/>
+      <w:r>
+        <w:rPr>
+          <w:lang w:val="en-GB"/>
+        </w:rPr>
+        <w:t xml:space="preserve">,” in </w:t>
       </w:r>
       <w:r>
         <w:rPr>
@@ -4657,7 +5304,15 @@
         <w:ind w:left="354" w:hanging="354"/>
       </w:pPr>
       <w:r>
-        <w:t xml:space="preserve">M. Marandi, A. Bertia, and S. Silas, “Implementing and automating security scanning in a DevSecOps CI/CD pipeline,” in </w:t>
+        <w:t xml:space="preserve">M. Marandi, A. Bertia, and S. Silas, “Implementing and automating security scanning in a </w:t>
+      </w:r>
+      <w:proofErr w:type="spellStart"/>
+      <w:r>
+        <w:t>DevSecOps</w:t>
+      </w:r>
+      <w:proofErr w:type="spellEnd"/>
+      <w:r>
+        <w:t xml:space="preserve"> CI/CD pipeline,” in </w:t>
       </w:r>
       <w:r>
         <w:rPr>
@@ -4680,7 +5335,21 @@
         <w:rPr>
           <w:lang w:val="en-GB"/>
         </w:rPr>
-        <w:t xml:space="preserve">S. Yulianto and G. N. C. Ngo, “Enhancing DevSecOps Pipelines with AI-Driven Threat Detection and Response,” in </w:t>
+        <w:t xml:space="preserve">S. Yulianto and G. N. C. Ngo, “Enhancing </w:t>
+      </w:r>
+      <w:proofErr w:type="spellStart"/>
+      <w:r>
+        <w:rPr>
+          <w:lang w:val="en-GB"/>
+        </w:rPr>
+        <w:t>DevSecOps</w:t>
+      </w:r>
+      <w:proofErr w:type="spellEnd"/>
+      <w:r>
+        <w:rPr>
+          <w:lang w:val="en-GB"/>
+        </w:rPr>
+        <w:t xml:space="preserve"> Pipelines with AI-Driven Threat Detection and Response,” in </w:t>
       </w:r>
       <w:r>
         <w:rPr>
@@ -4704,7 +5373,23 @@
         <w:ind w:left="354" w:hanging="354"/>
       </w:pPr>
       <w:r>
-        <w:t xml:space="preserve">M. Voggenreiter, F. Angermeir, F. Moyón, U. Schöpp, and P. Bonvin, “Automated security findings management: A case study in industrial DevOps,” in </w:t>
+        <w:t xml:space="preserve">M. </w:t>
+      </w:r>
+      <w:proofErr w:type="spellStart"/>
+      <w:r>
+        <w:t>Voggenreiter</w:t>
+      </w:r>
+      <w:proofErr w:type="spellEnd"/>
+      <w:r>
+        <w:t xml:space="preserve">, F. </w:t>
+      </w:r>
+      <w:proofErr w:type="spellStart"/>
+      <w:r>
+        <w:t>Angermeir</w:t>
+      </w:r>
+      <w:proofErr w:type="spellEnd"/>
+      <w:r>
+        <w:t xml:space="preserve">, F. Moyón, U. Schöpp, and P. Bonvin, “Automated security findings management: A case study in industrial DevOps,” in </w:t>
       </w:r>
       <w:r>
         <w:rPr>
@@ -4727,7 +5412,15 @@
         <w:ind w:left="354" w:hanging="354"/>
       </w:pPr>
       <w:r>
-        <w:t xml:space="preserve">A. Nayanajith and R. Wickramarachchi, “Challenges affecting the successful adoption of DevOps practices: A systematic literature review,” in </w:t>
+        <w:t xml:space="preserve">A. </w:t>
+      </w:r>
+      <w:proofErr w:type="spellStart"/>
+      <w:r>
+        <w:t>Nayanajith</w:t>
+      </w:r>
+      <w:proofErr w:type="spellEnd"/>
+      <w:r>
+        <w:t xml:space="preserve"> and R. Wickramarachchi, “Challenges affecting the successful adoption of DevOps practices: A systematic literature review,” in </w:t>
       </w:r>
       <w:r>
         <w:rPr>
@@ -4753,7 +5446,35 @@
         <w:rPr>
           <w:lang w:val="en-GB"/>
         </w:rPr>
-        <w:t xml:space="preserve">R. Rajab and M. Alnoukari, “DevOps Integration With Capability Model Maturity Integration: A Systematic Mapping Review,” </w:t>
+        <w:t xml:space="preserve">R. Rajab and M. </w:t>
+      </w:r>
+      <w:proofErr w:type="spellStart"/>
+      <w:r>
+        <w:rPr>
+          <w:lang w:val="en-GB"/>
+        </w:rPr>
+        <w:t>Alnoukari</w:t>
+      </w:r>
+      <w:proofErr w:type="spellEnd"/>
+      <w:r>
+        <w:rPr>
+          <w:lang w:val="en-GB"/>
+        </w:rPr>
+        <w:t xml:space="preserve">, “DevOps Integration </w:t>
+      </w:r>
+      <w:proofErr w:type="gramStart"/>
+      <w:r>
+        <w:rPr>
+          <w:lang w:val="en-GB"/>
+        </w:rPr>
+        <w:t>With</w:t>
+      </w:r>
+      <w:proofErr w:type="gramEnd"/>
+      <w:r>
+        <w:rPr>
+          <w:lang w:val="en-GB"/>
+        </w:rPr>
+        <w:t xml:space="preserve"> Capability Model Maturity Integration: A Systematic Mapping Review,” </w:t>
       </w:r>
       <w:r>
         <w:rPr>
@@ -4787,7 +5508,15 @@
         <w:t>et al.</w:t>
       </w:r>
       <w:r>
-        <w:t xml:space="preserve">, “Enhancing smart contract security through DevSecOps: An adaptive approach for vulnerability detection,” </w:t>
+        <w:t xml:space="preserve">, “Enhancing smart contract security through </w:t>
+      </w:r>
+      <w:proofErr w:type="spellStart"/>
+      <w:r>
+        <w:t>DevSecOps</w:t>
+      </w:r>
+      <w:proofErr w:type="spellEnd"/>
+      <w:r>
+        <w:t xml:space="preserve">: An adaptive approach for vulnerability detection,” </w:t>
       </w:r>
       <w:r>
         <w:rPr>
@@ -4809,7 +5538,15 @@
         <w:ind w:left="357" w:hanging="357"/>
       </w:pPr>
       <w:r>
-        <w:t xml:space="preserve">R. Ashtagi </w:t>
+        <w:t xml:space="preserve">R. </w:t>
+      </w:r>
+      <w:proofErr w:type="spellStart"/>
+      <w:r>
+        <w:t>Ashtagi</w:t>
+      </w:r>
+      <w:proofErr w:type="spellEnd"/>
+      <w:r>
+        <w:t xml:space="preserve"> </w:t>
       </w:r>
       <w:r>
         <w:rPr>
@@ -4895,7 +5632,23 @@
         <w:ind w:left="357" w:hanging="357"/>
       </w:pPr>
       <w:r>
-        <w:t xml:space="preserve">N. S, P. Manja, P. Mathur, and P. B. Honnavalli, “Extensive review of threat models for DevSecOps,” </w:t>
+        <w:t xml:space="preserve">N. S, P. Manja, P. Mathur, and P. B. </w:t>
+      </w:r>
+      <w:proofErr w:type="spellStart"/>
+      <w:r>
+        <w:t>Honnavalli</w:t>
+      </w:r>
+      <w:proofErr w:type="spellEnd"/>
+      <w:r>
+        <w:t xml:space="preserve">, “Extensive review of threat models for </w:t>
+      </w:r>
+      <w:proofErr w:type="spellStart"/>
+      <w:r>
+        <w:t>DevSecOps</w:t>
+      </w:r>
+      <w:proofErr w:type="spellEnd"/>
+      <w:r>
+        <w:t xml:space="preserve">,” </w:t>
       </w:r>
       <w:r>
         <w:rPr>
@@ -4917,7 +5670,15 @@
         <w:ind w:left="357" w:hanging="357"/>
       </w:pPr>
       <w:r>
-        <w:t xml:space="preserve">M. A. Akbar and A. A. Alsanad, “Empirical investigation of key enablers for secure DevOps practices,” </w:t>
+        <w:t xml:space="preserve">M. A. Akbar and A. A. </w:t>
+      </w:r>
+      <w:proofErr w:type="spellStart"/>
+      <w:r>
+        <w:t>Alsanad</w:t>
+      </w:r>
+      <w:proofErr w:type="spellEnd"/>
+      <w:r>
+        <w:t xml:space="preserve">, “Empirical investigation of key enablers for secure DevOps practices,” </w:t>
       </w:r>
       <w:r>
         <w:rPr>
@@ -5007,7 +5768,7 @@
 </file>
 
 <file path=word/endnotes.xml><?xml version="1.0" encoding="utf-8"?>
-<w:endnotes xmlns:wpc="http://schemas.microsoft.com/office/word/2010/wordprocessingCanvas" xmlns:cx="http://schemas.microsoft.com/office/drawing/2014/chartex" xmlns:cx1="http://schemas.microsoft.com/office/drawing/2015/9/8/chartex" xmlns:cx2="http://schemas.microsoft.com/office/drawing/2015/10/21/chartex" xmlns:cx3="http://schemas.microsoft.com/office/drawing/2016/5/9/chartex" xmlns:cx4="http://schemas.microsoft.com/office/drawing/2016/5/10/chartex" xmlns:cx5="http://schemas.microsoft.com/office/drawing/2016/5/11/chartex" xmlns:cx6="http://schemas.microsoft.com/office/drawing/2016/5/12/chartex" xmlns:cx7="http://schemas.microsoft.com/office/drawing/2016/5/13/chartex" xmlns:cx8="http://schemas.microsoft.com/office/drawing/2016/5/14/chartex" xmlns:mc="http://schemas.openxmlformats.org/markup-compatibility/2006" xmlns:aink="http://schemas.microsoft.com/office/drawing/2016/ink" xmlns:am3d="http://schemas.microsoft.com/office/drawing/2017/model3d" xmlns:o="urn:schemas-microsoft-com:office:office" xmlns:oel="http://schemas.microsoft.com/office/2019/extlst" xmlns:r="http://schemas.openxmlformats.org/officeDocument/2006/relationships" xmlns:m="http://schemas.openxmlformats.org/officeDocument/2006/math" xmlns:v="urn:schemas-microsoft-com:vml" xmlns:wp14="http://schemas.microsoft.com/office/word/2010/wordprocessingDrawing" xmlns:wp="http://schemas.openxmlformats.org/drawingml/2006/wordprocessingDrawing" xmlns:w10="urn:schemas-microsoft-com:office:word" xmlns:w="http://schemas.openxmlformats.org/wordprocessingml/2006/main" xmlns:w14="http://schemas.microsoft.com/office/word/2010/wordml" xmlns:w15="http://schemas.microsoft.com/office/word/2012/wordml" xmlns:w16cex="http://schemas.microsoft.com/office/word/2018/wordml/cex" xmlns:w16cid="http://schemas.microsoft.com/office/word/2016/wordml/cid" xmlns:w16="http://schemas.microsoft.com/office/word/2018/wordml" xmlns:w16du="http://schemas.microsoft.com/office/word/2023/wordml/word16du" xmlns:w16sdtdh="http://schemas.microsoft.com/office/word/2020/wordml/sdtdatahash" xmlns:w16sdtfl="http://schemas.microsoft.com/office/word/2024/wordml/sdtformatlock" xmlns:w16se="http://schemas.microsoft.com/office/word/2015/wordml/symex" xmlns:wpg="http://schemas.microsoft.com/office/word/2010/wordprocessingGroup" xmlns:wpi="http://schemas.microsoft.com/office/word/2010/wordprocessingInk" xmlns:wne="http://schemas.microsoft.com/office/word/2006/wordml" xmlns:wps="http://schemas.microsoft.com/office/word/2010/wordprocessingShape" mc:Ignorable="w14 w15 w16se w16cid w16 w16cex w16sdtdh w16sdtfl w16du wp14">
+<w:endnotes xmlns:wpc="http://schemas.microsoft.com/office/word/2010/wordprocessingCanvas" xmlns:cx="http://schemas.microsoft.com/office/drawing/2014/chartex" xmlns:cx1="http://schemas.microsoft.com/office/drawing/2015/9/8/chartex" xmlns:cx2="http://schemas.microsoft.com/office/drawing/2015/10/21/chartex" xmlns:cx3="http://schemas.microsoft.com/office/drawing/2016/5/9/chartex" xmlns:cx4="http://schemas.microsoft.com/office/drawing/2016/5/10/chartex" xmlns:cx5="http://schemas.microsoft.com/office/drawing/2016/5/11/chartex" xmlns:cx6="http://schemas.microsoft.com/office/drawing/2016/5/12/chartex" xmlns:cx7="http://schemas.microsoft.com/office/drawing/2016/5/13/chartex" xmlns:cx8="http://schemas.microsoft.com/office/drawing/2016/5/14/chartex" xmlns:mc="http://schemas.openxmlformats.org/markup-compatibility/2006" xmlns:aink="http://schemas.microsoft.com/office/drawing/2016/ink" xmlns:am3d="http://schemas.microsoft.com/office/drawing/2017/model3d" xmlns:o="urn:schemas-microsoft-com:office:office" xmlns:oel="http://schemas.microsoft.com/office/2019/extlst" xmlns:r="http://schemas.openxmlformats.org/officeDocument/2006/relationships" xmlns:m="http://schemas.openxmlformats.org/officeDocument/2006/math" xmlns:v="urn:schemas-microsoft-com:vml" xmlns:wp14="http://schemas.microsoft.com/office/word/2010/wordprocessingDrawing" xmlns:wp="http://schemas.openxmlformats.org/drawingml/2006/wordprocessingDrawing" xmlns:w10="urn:schemas-microsoft-com:office:word" xmlns:w="http://schemas.openxmlformats.org/wordprocessingml/2006/main" xmlns:w14="http://schemas.microsoft.com/office/word/2010/wordml" xmlns:w15="http://schemas.microsoft.com/office/word/2012/wordml" xmlns:w16cei="http://schemas.microsoft.com/office/word/2026/wordml/cei" xmlns:w16cex="http://schemas.microsoft.com/office/word/2018/wordml/cex" xmlns:w16cid="http://schemas.microsoft.com/office/word/2016/wordml/cid" xmlns:w16="http://schemas.microsoft.com/office/word/2018/wordml" xmlns:w16du="http://schemas.microsoft.com/office/word/2023/wordml/word16du" xmlns:w16sdtdh="http://schemas.microsoft.com/office/word/2020/wordml/sdtdatahash" xmlns:w16sdtfl="http://schemas.microsoft.com/office/word/2024/wordml/sdtformatlock" xmlns:w16se="http://schemas.microsoft.com/office/word/2015/wordml/symex" xmlns:wpg="http://schemas.microsoft.com/office/word/2010/wordprocessingGroup" xmlns:wpi="http://schemas.microsoft.com/office/word/2010/wordprocessingInk" xmlns:wne="http://schemas.microsoft.com/office/word/2006/wordml" xmlns:wps="http://schemas.microsoft.com/office/word/2010/wordprocessingShape" mc:Ignorable="w14 w15 w16se w16cid w16 w16cex w16sdtdh w16sdtfl w16du wp14">
   <w:endnote w:type="separator" w:id="-1">
     <w:p>
       <w:r>
@@ -5026,7 +5787,7 @@
 </file>
 
 <file path=word/footer1.xml><?xml version="1.0" encoding="utf-8"?>
-<w:ftr xmlns:wpc="http://schemas.microsoft.com/office/word/2010/wordprocessingCanvas" xmlns:cx="http://schemas.microsoft.com/office/drawing/2014/chartex" xmlns:cx1="http://schemas.microsoft.com/office/drawing/2015/9/8/chartex" xmlns:cx2="http://schemas.microsoft.com/office/drawing/2015/10/21/chartex" xmlns:cx3="http://schemas.microsoft.com/office/drawing/2016/5/9/chartex" xmlns:cx4="http://schemas.microsoft.com/office/drawing/2016/5/10/chartex" xmlns:cx5="http://schemas.microsoft.com/office/drawing/2016/5/11/chartex" xmlns:cx6="http://schemas.microsoft.com/office/drawing/2016/5/12/chartex" xmlns:cx7="http://schemas.microsoft.com/office/drawing/2016/5/13/chartex" xmlns:cx8="http://schemas.microsoft.com/office/drawing/2016/5/14/chartex" xmlns:mc="http://schemas.openxmlformats.org/markup-compatibility/2006" xmlns:aink="http://schemas.microsoft.com/office/drawing/2016/ink" xmlns:am3d="http://schemas.microsoft.com/office/drawing/2017/model3d" xmlns:o="urn:schemas-microsoft-com:office:office" xmlns:oel="http://schemas.microsoft.com/office/2019/extlst" xmlns:r="http://schemas.openxmlformats.org/officeDocument/2006/relationships" xmlns:m="http://schemas.openxmlformats.org/officeDocument/2006/math" xmlns:v="urn:schemas-microsoft-com:vml" xmlns:wp14="http://schemas.microsoft.com/office/word/2010/wordprocessingDrawing" xmlns:wp="http://schemas.openxmlformats.org/drawingml/2006/wordprocessingDrawing" xmlns:w10="urn:schemas-microsoft-com:office:word" xmlns:w="http://schemas.openxmlformats.org/wordprocessingml/2006/main" xmlns:w14="http://schemas.microsoft.com/office/word/2010/wordml" xmlns:w15="http://schemas.microsoft.com/office/word/2012/wordml" xmlns:w16cex="http://schemas.microsoft.com/office/word/2018/wordml/cex" xmlns:w16cid="http://schemas.microsoft.com/office/word/2016/wordml/cid" xmlns:w16="http://schemas.microsoft.com/office/word/2018/wordml" xmlns:w16du="http://schemas.microsoft.com/office/word/2023/wordml/word16du" xmlns:w16sdtdh="http://schemas.microsoft.com/office/word/2020/wordml/sdtdatahash" xmlns:w16sdtfl="http://schemas.microsoft.com/office/word/2024/wordml/sdtformatlock" xmlns:w16se="http://schemas.microsoft.com/office/word/2015/wordml/symex" xmlns:wpg="http://schemas.microsoft.com/office/word/2010/wordprocessingGroup" xmlns:wpi="http://schemas.microsoft.com/office/word/2010/wordprocessingInk" xmlns:wne="http://schemas.microsoft.com/office/word/2006/wordml" xmlns:wps="http://schemas.microsoft.com/office/word/2010/wordprocessingShape" mc:Ignorable="w14 w15 w16se w16cid w16 w16cex w16sdtdh w16sdtfl w16du wp14">
+<w:ftr xmlns:wpc="http://schemas.microsoft.com/office/word/2010/wordprocessingCanvas" xmlns:cx="http://schemas.microsoft.com/office/drawing/2014/chartex" xmlns:cx1="http://schemas.microsoft.com/office/drawing/2015/9/8/chartex" xmlns:cx2="http://schemas.microsoft.com/office/drawing/2015/10/21/chartex" xmlns:cx3="http://schemas.microsoft.com/office/drawing/2016/5/9/chartex" xmlns:cx4="http://schemas.microsoft.com/office/drawing/2016/5/10/chartex" xmlns:cx5="http://schemas.microsoft.com/office/drawing/2016/5/11/chartex" xmlns:cx6="http://schemas.microsoft.com/office/drawing/2016/5/12/chartex" xmlns:cx7="http://schemas.microsoft.com/office/drawing/2016/5/13/chartex" xmlns:cx8="http://schemas.microsoft.com/office/drawing/2016/5/14/chartex" xmlns:mc="http://schemas.openxmlformats.org/markup-compatibility/2006" xmlns:aink="http://schemas.microsoft.com/office/drawing/2016/ink" xmlns:am3d="http://schemas.microsoft.com/office/drawing/2017/model3d" xmlns:o="urn:schemas-microsoft-com:office:office" xmlns:oel="http://schemas.microsoft.com/office/2019/extlst" xmlns:r="http://schemas.openxmlformats.org/officeDocument/2006/relationships" xmlns:m="http://schemas.openxmlformats.org/officeDocument/2006/math" xmlns:v="urn:schemas-microsoft-com:vml" xmlns:wp14="http://schemas.microsoft.com/office/word/2010/wordprocessingDrawing" xmlns:wp="http://schemas.openxmlformats.org/drawingml/2006/wordprocessingDrawing" xmlns:w10="urn:schemas-microsoft-com:office:word" xmlns:w="http://schemas.openxmlformats.org/wordprocessingml/2006/main" xmlns:w14="http://schemas.microsoft.com/office/word/2010/wordml" xmlns:w15="http://schemas.microsoft.com/office/word/2012/wordml" xmlns:w16cei="http://schemas.microsoft.com/office/word/2026/wordml/cei" xmlns:w16cex="http://schemas.microsoft.com/office/word/2018/wordml/cex" xmlns:w16cid="http://schemas.microsoft.com/office/word/2016/wordml/cid" xmlns:w16="http://schemas.microsoft.com/office/word/2018/wordml" xmlns:w16du="http://schemas.microsoft.com/office/word/2023/wordml/word16du" xmlns:w16sdtdh="http://schemas.microsoft.com/office/word/2020/wordml/sdtdatahash" xmlns:w16sdtfl="http://schemas.microsoft.com/office/word/2024/wordml/sdtformatlock" xmlns:w16se="http://schemas.microsoft.com/office/word/2015/wordml/symex" xmlns:wpg="http://schemas.microsoft.com/office/word/2010/wordprocessingGroup" xmlns:wpi="http://schemas.microsoft.com/office/word/2010/wordprocessingInk" xmlns:wne="http://schemas.microsoft.com/office/word/2006/wordml" xmlns:wps="http://schemas.microsoft.com/office/word/2010/wordprocessingShape" mc:Ignorable="w14 w15 w16se w16cid w16 w16cex w16sdtdh w16sdtfl w16du wp14">
   <w:sdt>
     <w:sdtPr>
       <w:id w:val="1601918810"/>
@@ -5085,7 +5846,7 @@
 </file>
 
 <file path=word/footnotes.xml><?xml version="1.0" encoding="utf-8"?>
-<w:footnotes xmlns:wpc="http://schemas.microsoft.com/office/word/2010/wordprocessingCanvas" xmlns:cx="http://schemas.microsoft.com/office/drawing/2014/chartex" xmlns:cx1="http://schemas.microsoft.com/office/drawing/2015/9/8/chartex" xmlns:cx2="http://schemas.microsoft.com/office/drawing/2015/10/21/chartex" xmlns:cx3="http://schemas.microsoft.com/office/drawing/2016/5/9/chartex" xmlns:cx4="http://schemas.microsoft.com/office/drawing/2016/5/10/chartex" xmlns:cx5="http://schemas.microsoft.com/office/drawing/2016/5/11/chartex" xmlns:cx6="http://schemas.microsoft.com/office/drawing/2016/5/12/chartex" xmlns:cx7="http://schemas.microsoft.com/office/drawing/2016/5/13/chartex" xmlns:cx8="http://schemas.microsoft.com/office/drawing/2016/5/14/chartex" xmlns:mc="http://schemas.openxmlformats.org/markup-compatibility/2006" xmlns:aink="http://schemas.microsoft.com/office/drawing/2016/ink" xmlns:am3d="http://schemas.microsoft.com/office/drawing/2017/model3d" xmlns:o="urn:schemas-microsoft-com:office:office" xmlns:oel="http://schemas.microsoft.com/office/2019/extlst" xmlns:r="http://schemas.openxmlformats.org/officeDocument/2006/relationships" xmlns:m="http://schemas.openxmlformats.org/officeDocument/2006/math" xmlns:v="urn:schemas-microsoft-com:vml" xmlns:wp14="http://schemas.microsoft.com/office/word/2010/wordprocessingDrawing" xmlns:wp="http://schemas.openxmlformats.org/drawingml/2006/wordprocessingDrawing" xmlns:w10="urn:schemas-microsoft-com:office:word" xmlns:w="http://schemas.openxmlformats.org/wordprocessingml/2006/main" xmlns:w14="http://schemas.microsoft.com/office/word/2010/wordml" xmlns:w15="http://schemas.microsoft.com/office/word/2012/wordml" xmlns:w16cex="http://schemas.microsoft.com/office/word/2018/wordml/cex" xmlns:w16cid="http://schemas.microsoft.com/office/word/2016/wordml/cid" xmlns:w16="http://schemas.microsoft.com/office/word/2018/wordml" xmlns:w16du="http://schemas.microsoft.com/office/word/2023/wordml/word16du" xmlns:w16sdtdh="http://schemas.microsoft.com/office/word/2020/wordml/sdtdatahash" xmlns:w16sdtfl="http://schemas.microsoft.com/office/word/2024/wordml/sdtformatlock" xmlns:w16se="http://schemas.microsoft.com/office/word/2015/wordml/symex" xmlns:wpg="http://schemas.microsoft.com/office/word/2010/wordprocessingGroup" xmlns:wpi="http://schemas.microsoft.com/office/word/2010/wordprocessingInk" xmlns:wne="http://schemas.microsoft.com/office/word/2006/wordml" xmlns:wps="http://schemas.microsoft.com/office/word/2010/wordprocessingShape" mc:Ignorable="w14 w15 w16se w16cid w16 w16cex w16sdtdh w16sdtfl w16du wp14">
+<w:footnotes xmlns:wpc="http://schemas.microsoft.com/office/word/2010/wordprocessingCanvas" xmlns:cx="http://schemas.microsoft.com/office/drawing/2014/chartex" xmlns:cx1="http://schemas.microsoft.com/office/drawing/2015/9/8/chartex" xmlns:cx2="http://schemas.microsoft.com/office/drawing/2015/10/21/chartex" xmlns:cx3="http://schemas.microsoft.com/office/drawing/2016/5/9/chartex" xmlns:cx4="http://schemas.microsoft.com/office/drawing/2016/5/10/chartex" xmlns:cx5="http://schemas.microsoft.com/office/drawing/2016/5/11/chartex" xmlns:cx6="http://schemas.microsoft.com/office/drawing/2016/5/12/chartex" xmlns:cx7="http://schemas.microsoft.com/office/drawing/2016/5/13/chartex" xmlns:cx8="http://schemas.microsoft.com/office/drawing/2016/5/14/chartex" xmlns:mc="http://schemas.openxmlformats.org/markup-compatibility/2006" xmlns:aink="http://schemas.microsoft.com/office/drawing/2016/ink" xmlns:am3d="http://schemas.microsoft.com/office/drawing/2017/model3d" xmlns:o="urn:schemas-microsoft-com:office:office" xmlns:oel="http://schemas.microsoft.com/office/2019/extlst" xmlns:r="http://schemas.openxmlformats.org/officeDocument/2006/relationships" xmlns:m="http://schemas.openxmlformats.org/officeDocument/2006/math" xmlns:v="urn:schemas-microsoft-com:vml" xmlns:wp14="http://schemas.microsoft.com/office/word/2010/wordprocessingDrawing" xmlns:wp="http://schemas.openxmlformats.org/drawingml/2006/wordprocessingDrawing" xmlns:w10="urn:schemas-microsoft-com:office:word" xmlns:w="http://schemas.openxmlformats.org/wordprocessingml/2006/main" xmlns:w14="http://schemas.microsoft.com/office/word/2010/wordml" xmlns:w15="http://schemas.microsoft.com/office/word/2012/wordml" xmlns:w16cei="http://schemas.microsoft.com/office/word/2026/wordml/cei" xmlns:w16cex="http://schemas.microsoft.com/office/word/2018/wordml/cex" xmlns:w16cid="http://schemas.microsoft.com/office/word/2016/wordml/cid" xmlns:w16="http://schemas.microsoft.com/office/word/2018/wordml" xmlns:w16du="http://schemas.microsoft.com/office/word/2023/wordml/word16du" xmlns:w16sdtdh="http://schemas.microsoft.com/office/word/2020/wordml/sdtdatahash" xmlns:w16sdtfl="http://schemas.microsoft.com/office/word/2024/wordml/sdtformatlock" xmlns:w16se="http://schemas.microsoft.com/office/word/2015/wordml/symex" xmlns:wpg="http://schemas.microsoft.com/office/word/2010/wordprocessingGroup" xmlns:wpi="http://schemas.microsoft.com/office/word/2010/wordprocessingInk" xmlns:wne="http://schemas.microsoft.com/office/word/2006/wordml" xmlns:wps="http://schemas.microsoft.com/office/word/2010/wordprocessingShape" mc:Ignorable="w14 w15 w16se w16cid w16 w16cex w16sdtdh w16sdtfl w16du wp14">
   <w:footnote w:type="separator" w:id="-1">
     <w:p>
       <w:r>
@@ -5104,7 +5865,7 @@
 </file>
 
 <file path=word/numbering.xml><?xml version="1.0" encoding="utf-8"?>
-<w:numbering xmlns:wpc="http://schemas.microsoft.com/office/word/2010/wordprocessingCanvas" xmlns:cx="http://schemas.microsoft.com/office/drawing/2014/chartex" xmlns:cx1="http://schemas.microsoft.com/office/drawing/2015/9/8/chartex" xmlns:cx2="http://schemas.microsoft.com/office/drawing/2015/10/21/chartex" xmlns:cx3="http://schemas.microsoft.com/office/drawing/2016/5/9/chartex" xmlns:cx4="http://schemas.microsoft.com/office/drawing/2016/5/10/chartex" xmlns:cx5="http://schemas.microsoft.com/office/drawing/2016/5/11/chartex" xmlns:cx6="http://schemas.microsoft.com/office/drawing/2016/5/12/chartex" xmlns:cx7="http://schemas.microsoft.com/office/drawing/2016/5/13/chartex" xmlns:cx8="http://schemas.microsoft.com/office/drawing/2016/5/14/chartex" xmlns:mc="http://schemas.openxmlformats.org/markup-compatibility/2006" xmlns:aink="http://schemas.microsoft.com/office/drawing/2016/ink" xmlns:am3d="http://schemas.microsoft.com/office/drawing/2017/model3d" xmlns:o="urn:schemas-microsoft-com:office:office" xmlns:oel="http://schemas.microsoft.com/office/2019/extlst" xmlns:r="http://schemas.openxmlformats.org/officeDocument/2006/relationships" xmlns:m="http://schemas.openxmlformats.org/officeDocument/2006/math" xmlns:v="urn:schemas-microsoft-com:vml" xmlns:wp14="http://schemas.microsoft.com/office/word/2010/wordprocessingDrawing" xmlns:wp="http://schemas.openxmlformats.org/drawingml/2006/wordprocessingDrawing" xmlns:w10="urn:schemas-microsoft-com:office:word" xmlns:w="http://schemas.openxmlformats.org/wordprocessingml/2006/main" xmlns:w14="http://schemas.microsoft.com/office/word/2010/wordml" xmlns:w15="http://schemas.microsoft.com/office/word/2012/wordml" xmlns:w16cex="http://schemas.microsoft.com/office/word/2018/wordml/cex" xmlns:w16cid="http://schemas.microsoft.com/office/word/2016/wordml/cid" xmlns:w16="http://schemas.microsoft.com/office/word/2018/wordml" xmlns:w16du="http://schemas.microsoft.com/office/word/2023/wordml/word16du" xmlns:w16sdtdh="http://schemas.microsoft.com/office/word/2020/wordml/sdtdatahash" xmlns:w16sdtfl="http://schemas.microsoft.com/office/word/2024/wordml/sdtformatlock" xmlns:w16se="http://schemas.microsoft.com/office/word/2015/wordml/symex" xmlns:wpg="http://schemas.microsoft.com/office/word/2010/wordprocessingGroup" xmlns:wpi="http://schemas.microsoft.com/office/word/2010/wordprocessingInk" xmlns:wne="http://schemas.microsoft.com/office/word/2006/wordml" xmlns:wps="http://schemas.microsoft.com/office/word/2010/wordprocessingShape" mc:Ignorable="w14 w15 w16se w16cid w16 w16cex w16sdtdh w16sdtfl w16du wp14">
+<w:numbering xmlns:wpc="http://schemas.microsoft.com/office/word/2010/wordprocessingCanvas" xmlns:cx="http://schemas.microsoft.com/office/drawing/2014/chartex" xmlns:cx1="http://schemas.microsoft.com/office/drawing/2015/9/8/chartex" xmlns:cx2="http://schemas.microsoft.com/office/drawing/2015/10/21/chartex" xmlns:cx3="http://schemas.microsoft.com/office/drawing/2016/5/9/chartex" xmlns:cx4="http://schemas.microsoft.com/office/drawing/2016/5/10/chartex" xmlns:cx5="http://schemas.microsoft.com/office/drawing/2016/5/11/chartex" xmlns:cx6="http://schemas.microsoft.com/office/drawing/2016/5/12/chartex" xmlns:cx7="http://schemas.microsoft.com/office/drawing/2016/5/13/chartex" xmlns:cx8="http://schemas.microsoft.com/office/drawing/2016/5/14/chartex" xmlns:mc="http://schemas.openxmlformats.org/markup-compatibility/2006" xmlns:aink="http://schemas.microsoft.com/office/drawing/2016/ink" xmlns:am3d="http://schemas.microsoft.com/office/drawing/2017/model3d" xmlns:o="urn:schemas-microsoft-com:office:office" xmlns:oel="http://schemas.microsoft.com/office/2019/extlst" xmlns:r="http://schemas.openxmlformats.org/officeDocument/2006/relationships" xmlns:m="http://schemas.openxmlformats.org/officeDocument/2006/math" xmlns:v="urn:schemas-microsoft-com:vml" xmlns:wp14="http://schemas.microsoft.com/office/word/2010/wordprocessingDrawing" xmlns:wp="http://schemas.openxmlformats.org/drawingml/2006/wordprocessingDrawing" xmlns:w10="urn:schemas-microsoft-com:office:word" xmlns:w="http://schemas.openxmlformats.org/wordprocessingml/2006/main" xmlns:w14="http://schemas.microsoft.com/office/word/2010/wordml" xmlns:w15="http://schemas.microsoft.com/office/word/2012/wordml" xmlns:w16cei="http://schemas.microsoft.com/office/word/2026/wordml/cei" xmlns:w16cex="http://schemas.microsoft.com/office/word/2018/wordml/cex" xmlns:w16cid="http://schemas.microsoft.com/office/word/2016/wordml/cid" xmlns:w16="http://schemas.microsoft.com/office/word/2018/wordml" xmlns:w16du="http://schemas.microsoft.com/office/word/2023/wordml/word16du" xmlns:w16sdtdh="http://schemas.microsoft.com/office/word/2020/wordml/sdtdatahash" xmlns:w16sdtfl="http://schemas.microsoft.com/office/word/2024/wordml/sdtformatlock" xmlns:w16se="http://schemas.microsoft.com/office/word/2015/wordml/symex" xmlns:wpg="http://schemas.microsoft.com/office/word/2010/wordprocessingGroup" xmlns:wpi="http://schemas.microsoft.com/office/word/2010/wordprocessingInk" xmlns:wne="http://schemas.microsoft.com/office/word/2006/wordml" xmlns:wps="http://schemas.microsoft.com/office/word/2010/wordprocessingShape" mc:Ignorable="w14 w15 w16se w16cid w16 w16cex w16sdtdh w16sdtfl w16du wp14">
   <w:abstractNum w:abstractNumId="0" w15:restartNumberingAfterBreak="0">
     <w:nsid w:val="37660336"/>
     <w:multiLevelType w:val="multilevel"/>
@@ -5788,7 +6549,6 @@
   <w:style w:type="character" w:default="1" w:styleId="DefaultParagraphFont">
     <w:name w:val="Default Paragraph Font"/>
     <w:uiPriority w:val="1"/>
-    <w:semiHidden/>
     <w:unhideWhenUsed/>
   </w:style>
   <w:style w:type="table" w:default="1" w:styleId="TableNormal">

</xml_diff>